<commit_message>
Lagre Rapport_99-snapshot og oppdatert HiMolde-mal
LOG650_Rapport_99.docx/.pdf er en arbeidsversjon brukt under
sluttbearbeiding. Malen Mal prosjekt LOG650 v2.docx er endret i
samme runde.

Co-Authored-By: Claude Opus 4.7 (1M context) <noreply@anthropic.com>
</commit_message>
<xml_diff>
--- a/000 templates/Mal prosjekt LOG650 v2.docx
+++ b/000 templates/Mal prosjekt LOG650 v2.docx
@@ -4585,6 +4585,7 @@
             <w:checkBox>
               <w:sizeAuto/>
               <w:default w:val="0"/>
+              <w:checked w:val="0"/>
             </w:checkBox>
           </w:ffData>
         </w:fldChar>
@@ -4920,4115 +4921,13 @@
         </w:sectPr>
       </w:pPr>
     </w:p>
-    <w:p>
-      <w:pPr>
-        <w:rPr>
-          <w:rFonts w:ascii="Trebuchet MS" w:hAnsi="Trebuchet MS" w:cs="Arial"/>
-        </w:rPr>
-      </w:pPr>
-      <w:r>
-        <w:rPr>
-          <w:rFonts w:ascii="Trebuchet MS" w:hAnsi="Trebuchet MS" w:cs="Arial"/>
-          <w:b/>
-        </w:rPr>
-        <w:lastRenderedPageBreak/>
-        <w:t xml:space="preserve">Antall ord: </w:t>
-      </w:r>
-      <w:r>
-        <w:rPr>
-          <w:rFonts w:ascii="Trebuchet MS" w:hAnsi="Trebuchet MS" w:cs="Arial"/>
-        </w:rPr>
-        <w:t>Marker denne setningen,</w:t>
-      </w:r>
-      <w:r>
-        <w:rPr>
-          <w:rFonts w:ascii="Trebuchet MS" w:hAnsi="Trebuchet MS" w:cs="Arial"/>
-        </w:rPr>
-        <w:t xml:space="preserve"> og skriv inn antall ord dersom det er et krav </w:t>
-      </w:r>
-      <w:r>
-        <w:rPr>
-          <w:rFonts w:ascii="Trebuchet MS" w:hAnsi="Trebuchet MS" w:cs="Arial"/>
-        </w:rPr>
-        <w:t xml:space="preserve">at antall ord skal oppgis. Hvis det ikke er </w:t>
-      </w:r>
-      <w:r>
-        <w:rPr>
-          <w:rFonts w:ascii="Trebuchet MS" w:hAnsi="Trebuchet MS" w:cs="Arial"/>
-        </w:rPr>
-        <w:t xml:space="preserve">et </w:t>
-      </w:r>
-      <w:r>
-        <w:rPr>
-          <w:rFonts w:ascii="Trebuchet MS" w:hAnsi="Trebuchet MS" w:cs="Arial"/>
-        </w:rPr>
-        <w:t>krav at antall ord skal oppgis slettes hele dette avsnitt</w:t>
-      </w:r>
-      <w:r>
-        <w:rPr>
-          <w:rFonts w:ascii="Trebuchet MS" w:hAnsi="Trebuchet MS" w:cs="Arial"/>
-        </w:rPr>
-        <w:t>et</w:t>
-      </w:r>
-      <w:r>
-        <w:rPr>
-          <w:rFonts w:ascii="Trebuchet MS" w:hAnsi="Trebuchet MS" w:cs="Arial"/>
-        </w:rPr>
-        <w:t xml:space="preserve">, og i begge tilfeller slettes denne setning. </w:t>
-      </w:r>
-    </w:p>
-    <w:p>
-      <w:pPr>
-        <w:rPr>
-          <w:rFonts w:ascii="Trebuchet MS" w:hAnsi="Trebuchet MS" w:cs="Arial"/>
-        </w:rPr>
-      </w:pPr>
-    </w:p>
-    <w:p>
-      <w:pPr>
-        <w:rPr>
-          <w:rFonts w:ascii="Trebuchet MS" w:hAnsi="Trebuchet MS" w:cs="Arial"/>
-        </w:rPr>
-      </w:pPr>
-      <w:r>
-        <w:rPr>
-          <w:rFonts w:ascii="Trebuchet MS" w:hAnsi="Trebuchet MS" w:cs="Arial"/>
-          <w:b/>
-        </w:rPr>
-        <w:t>Forfattererklæring</w:t>
-      </w:r>
-      <w:r>
-        <w:rPr>
-          <w:rFonts w:ascii="Trebuchet MS" w:hAnsi="Trebuchet MS" w:cs="Arial"/>
-        </w:rPr>
-        <w:t xml:space="preserve">: </w:t>
-      </w:r>
-      <w:r>
-        <w:rPr>
-          <w:rFonts w:ascii="Trebuchet MS" w:hAnsi="Trebuchet MS" w:cs="Arial"/>
-        </w:rPr>
-        <w:t xml:space="preserve">Marker denne setningen, og skriv inn </w:t>
-      </w:r>
-      <w:r>
-        <w:rPr>
-          <w:rFonts w:ascii="Trebuchet MS" w:hAnsi="Trebuchet MS" w:cs="Arial"/>
-        </w:rPr>
-        <w:t>forfattererklæring dersom det er et krav til oppgaven</w:t>
-      </w:r>
-      <w:r>
-        <w:rPr>
-          <w:rFonts w:ascii="Trebuchet MS" w:hAnsi="Trebuchet MS" w:cs="Arial"/>
-        </w:rPr>
-        <w:t xml:space="preserve">. Hvis </w:t>
-      </w:r>
-      <w:r>
-        <w:rPr>
-          <w:rFonts w:ascii="Trebuchet MS" w:hAnsi="Trebuchet MS" w:cs="Arial"/>
-        </w:rPr>
-        <w:t xml:space="preserve">det ikke er krav om </w:t>
-      </w:r>
-      <w:r>
-        <w:rPr>
-          <w:rFonts w:ascii="Trebuchet MS" w:hAnsi="Trebuchet MS" w:cs="Arial"/>
-        </w:rPr>
-        <w:t>forfattererklæring</w:t>
-      </w:r>
-      <w:r>
-        <w:rPr>
-          <w:rFonts w:ascii="Trebuchet MS" w:hAnsi="Trebuchet MS" w:cs="Arial"/>
-        </w:rPr>
-        <w:t xml:space="preserve"> slettes hele dette avsnitt, og i begge tilfeller slettes denne setning. </w:t>
-      </w:r>
-    </w:p>
-    <w:p>
-      <w:pPr>
-        <w:rPr>
-          <w:rFonts w:ascii="Trebuchet MS" w:hAnsi="Trebuchet MS" w:cs="Arial"/>
-        </w:rPr>
-      </w:pPr>
-    </w:p>
-    <w:p>
-      <w:pPr>
-        <w:rPr>
-          <w:rFonts w:cs="Times New Roman"/>
-        </w:rPr>
-      </w:pPr>
-    </w:p>
-    <w:p/>
-    <w:p>
-      <w:pPr>
-        <w:sectPr>
-          <w:pgSz w:w="11907" w:h="16840"/>
-          <w:pgMar w:top="1411" w:right="1411" w:bottom="1411" w:left="1728" w:header="720" w:footer="403" w:gutter="0"/>
-          <w:cols w:space="720"/>
-          <w:formProt w:val="0"/>
-          <w:titlePg/>
-        </w:sectPr>
-      </w:pPr>
-    </w:p>
-    <w:p>
-      <w:pPr>
-        <w:jc w:val="center"/>
-        <w:rPr>
-          <w:rFonts w:ascii="Arial" w:hAnsi="Arial" w:cs="Arial"/>
-          <w:b/>
-          <w:sz w:val="28"/>
-          <w:szCs w:val="28"/>
-        </w:rPr>
-      </w:pPr>
-      <w:r>
-        <w:rPr>
-          <w:rFonts w:ascii="Arial" w:hAnsi="Arial" w:cs="Arial"/>
-          <w:b/>
-          <w:sz w:val="28"/>
-          <w:szCs w:val="28"/>
-        </w:rPr>
-        <w:lastRenderedPageBreak/>
-        <w:t>Sam</w:t>
-      </w:r>
-      <w:r>
-        <w:rPr>
-          <w:rFonts w:ascii="Arial" w:hAnsi="Arial" w:cs="Arial"/>
-          <w:b/>
-          <w:sz w:val="28"/>
-          <w:szCs w:val="28"/>
-        </w:rPr>
-        <w:t>mendrag</w:t>
-      </w:r>
-    </w:p>
-    <w:p>
-      <w:pPr>
-        <w:rPr>
-          <w:rFonts w:ascii="Arial" w:hAnsi="Arial" w:cs="Arial"/>
-          <w:b/>
-          <w:sz w:val="28"/>
-          <w:szCs w:val="28"/>
-        </w:rPr>
-      </w:pPr>
-      <w:r>
-        <w:rPr>
-          <w:rFonts w:ascii="Arial" w:hAnsi="Arial" w:cs="Arial"/>
-          <w:b/>
-          <w:sz w:val="28"/>
-          <w:szCs w:val="28"/>
-        </w:rPr>
-        <w:br w:type="page"/>
-      </w:r>
-    </w:p>
-    <w:p>
-      <w:pPr>
-        <w:jc w:val="center"/>
-        <w:rPr>
-          <w:rFonts w:ascii="Arial" w:hAnsi="Arial" w:cs="Arial"/>
-          <w:b/>
-          <w:sz w:val="28"/>
-          <w:szCs w:val="28"/>
-        </w:rPr>
-      </w:pPr>
-      <w:proofErr w:type="spellStart"/>
-      <w:r>
-        <w:rPr>
-          <w:rFonts w:ascii="Arial" w:hAnsi="Arial" w:cs="Arial"/>
-          <w:b/>
-          <w:sz w:val="28"/>
-          <w:szCs w:val="28"/>
-        </w:rPr>
-        <w:lastRenderedPageBreak/>
-        <w:t>Abstract</w:t>
-      </w:r>
-      <w:proofErr w:type="spellEnd"/>
-    </w:p>
-    <w:p>
-      <w:pPr>
-        <w:rPr>
-          <w:rFonts w:ascii="Arial" w:hAnsi="Arial" w:cs="Arial"/>
-          <w:b/>
-          <w:sz w:val="28"/>
-          <w:szCs w:val="28"/>
-        </w:rPr>
-      </w:pPr>
-      <w:r>
-        <w:rPr>
-          <w:rFonts w:ascii="Arial" w:hAnsi="Arial" w:cs="Arial"/>
-          <w:b/>
-          <w:sz w:val="28"/>
-          <w:szCs w:val="28"/>
-        </w:rPr>
-        <w:br w:type="page"/>
-      </w:r>
-    </w:p>
-    <w:p/>
-    <w:p>
-      <w:pPr>
-        <w:sectPr>
-          <w:pgSz w:w="11907" w:h="16840"/>
-          <w:pgMar w:top="1411" w:right="1411" w:bottom="1411" w:left="1728" w:header="720" w:footer="403" w:gutter="0"/>
-          <w:cols w:space="720"/>
-          <w:formProt w:val="0"/>
-          <w:titlePg/>
-        </w:sectPr>
-      </w:pPr>
-    </w:p>
-    <w:p>
-      <w:pPr>
-        <w:pStyle w:val="INNH1"/>
-        <w:tabs>
-          <w:tab w:val="left" w:pos="660"/>
-        </w:tabs>
-        <w:rPr>
-          <w:rFonts w:ascii="Arial" w:hAnsi="Arial" w:cs="Arial"/>
-          <w:b w:val="0"/>
-          <w:sz w:val="28"/>
-          <w:szCs w:val="28"/>
-        </w:rPr>
-      </w:pPr>
-      <w:r>
-        <w:rPr>
-          <w:rFonts w:ascii="Arial" w:hAnsi="Arial" w:cs="Arial"/>
-          <w:b w:val="0"/>
-          <w:sz w:val="28"/>
-          <w:szCs w:val="28"/>
-        </w:rPr>
-        <w:lastRenderedPageBreak/>
-        <w:t>Inn</w:t>
-      </w:r>
-      <w:r>
-        <w:rPr>
-          <w:rFonts w:ascii="Arial" w:hAnsi="Arial" w:cs="Arial"/>
-          <w:b w:val="0"/>
-          <w:sz w:val="28"/>
-          <w:szCs w:val="28"/>
-        </w:rPr>
-        <w:t>hold</w:t>
-      </w:r>
-    </w:p>
-    <w:p>
-      <w:pPr>
-        <w:pStyle w:val="INNH1"/>
-        <w:tabs>
-          <w:tab w:val="left" w:pos="720"/>
-        </w:tabs>
-        <w:rPr>
-          <w:rFonts w:asciiTheme="minorHAnsi" w:eastAsiaTheme="minorEastAsia" w:hAnsiTheme="minorHAnsi" w:cstheme="minorBidi"/>
-          <w:b w:val="0"/>
-          <w:kern w:val="2"/>
-          <w:lang w:val="en-GB" w:eastAsia="en-GB" w:bidi="ar-SA"/>
-          <w14:ligatures w14:val="standardContextual"/>
-        </w:rPr>
-      </w:pPr>
-      <w:r>
-        <w:rPr>
-          <w:rFonts w:ascii="Arial" w:hAnsi="Arial" w:cs="Arial"/>
-          <w:b w:val="0"/>
-          <w:sz w:val="28"/>
-          <w:szCs w:val="28"/>
-        </w:rPr>
-        <w:fldChar w:fldCharType="begin"/>
-      </w:r>
-      <w:r>
-        <w:rPr>
-          <w:rFonts w:ascii="Arial" w:hAnsi="Arial" w:cs="Arial"/>
-          <w:b w:val="0"/>
-          <w:sz w:val="28"/>
-          <w:szCs w:val="28"/>
-        </w:rPr>
-        <w:instrText xml:space="preserve"> TOC \o "1-3" \h \z \u </w:instrText>
-      </w:r>
-      <w:r>
-        <w:rPr>
-          <w:rFonts w:ascii="Arial" w:hAnsi="Arial" w:cs="Arial"/>
-          <w:b w:val="0"/>
-          <w:sz w:val="28"/>
-          <w:szCs w:val="28"/>
-        </w:rPr>
-        <w:fldChar w:fldCharType="separate"/>
-      </w:r>
-      <w:hyperlink w:anchor="_Toc222057403" w:history="1">
-        <w:r>
-          <w:rPr>
-            <w:rStyle w:val="Hyperkobling"/>
-          </w:rPr>
-          <w:t>1.0</w:t>
-        </w:r>
-        <w:r>
-          <w:rPr>
-            <w:rFonts w:asciiTheme="minorHAnsi" w:eastAsiaTheme="minorEastAsia" w:hAnsiTheme="minorHAnsi" w:cstheme="minorBidi"/>
-            <w:b w:val="0"/>
-            <w:kern w:val="2"/>
-            <w:lang w:val="en-GB" w:eastAsia="en-GB" w:bidi="ar-SA"/>
-            <w14:ligatures w14:val="standardContextual"/>
-          </w:rPr>
-          <w:tab/>
-        </w:r>
-        <w:r>
-          <w:rPr>
-            <w:rStyle w:val="Hyperkobling"/>
-          </w:rPr>
-          <w:t>Innledning</w:t>
-        </w:r>
-        <w:r>
-          <w:rPr>
-            <w:webHidden/>
-          </w:rPr>
-          <w:tab/>
-        </w:r>
-        <w:r>
-          <w:rPr>
-            <w:webHidden/>
-          </w:rPr>
-          <w:fldChar w:fldCharType="begin"/>
-        </w:r>
-        <w:r>
-          <w:rPr>
-            <w:webHidden/>
-          </w:rPr>
-          <w:instrText xml:space="preserve"> PAGEREF _Toc222057403 \h </w:instrText>
-        </w:r>
-        <w:r>
-          <w:rPr>
-            <w:webHidden/>
-          </w:rPr>
-        </w:r>
-        <w:r>
-          <w:rPr>
-            <w:webHidden/>
-          </w:rPr>
-          <w:fldChar w:fldCharType="separate"/>
-        </w:r>
-        <w:r>
-          <w:rPr>
-            <w:webHidden/>
-          </w:rPr>
-          <w:t>1</w:t>
-        </w:r>
-        <w:r>
-          <w:rPr>
-            <w:webHidden/>
-          </w:rPr>
-          <w:fldChar w:fldCharType="end"/>
-        </w:r>
-      </w:hyperlink>
-    </w:p>
-    <w:p>
-      <w:pPr>
-        <w:pStyle w:val="INNH2"/>
-        <w:tabs>
-          <w:tab w:val="left" w:pos="960"/>
-          <w:tab w:val="right" w:leader="dot" w:pos="8758"/>
-        </w:tabs>
-        <w:rPr>
-          <w:rFonts w:asciiTheme="minorHAnsi" w:eastAsiaTheme="minorEastAsia" w:hAnsiTheme="minorHAnsi" w:cstheme="minorBidi"/>
-          <w:noProof/>
-          <w:kern w:val="2"/>
-          <w:lang w:val="en-GB" w:eastAsia="en-GB" w:bidi="ar-SA"/>
-          <w14:ligatures w14:val="standardContextual"/>
-        </w:rPr>
-      </w:pPr>
-      <w:hyperlink w:anchor="_Toc222057404" w:history="1">
-        <w:r>
-          <w:rPr>
-            <w:rStyle w:val="Hyperkobling"/>
-            <w:noProof/>
-          </w:rPr>
-          <w:t>1.1</w:t>
-        </w:r>
-        <w:r>
-          <w:rPr>
-            <w:rFonts w:asciiTheme="minorHAnsi" w:eastAsiaTheme="minorEastAsia" w:hAnsiTheme="minorHAnsi" w:cstheme="minorBidi"/>
-            <w:noProof/>
-            <w:kern w:val="2"/>
-            <w:lang w:val="en-GB" w:eastAsia="en-GB" w:bidi="ar-SA"/>
-            <w14:ligatures w14:val="standardContextual"/>
-          </w:rPr>
-          <w:tab/>
-        </w:r>
-        <w:r>
-          <w:rPr>
-            <w:rStyle w:val="Hyperkobling"/>
-            <w:noProof/>
-          </w:rPr>
-          <w:t>Problemstilling</w:t>
-        </w:r>
-        <w:r>
-          <w:rPr>
-            <w:noProof/>
-            <w:webHidden/>
-          </w:rPr>
-          <w:tab/>
-        </w:r>
-        <w:r>
-          <w:rPr>
-            <w:noProof/>
-            <w:webHidden/>
-          </w:rPr>
-          <w:fldChar w:fldCharType="begin"/>
-        </w:r>
-        <w:r>
-          <w:rPr>
-            <w:noProof/>
-            <w:webHidden/>
-          </w:rPr>
-          <w:instrText xml:space="preserve"> PAGEREF _Toc222057404 \h </w:instrText>
-        </w:r>
-        <w:r>
-          <w:rPr>
-            <w:noProof/>
-            <w:webHidden/>
-          </w:rPr>
-        </w:r>
-        <w:r>
-          <w:rPr>
-            <w:noProof/>
-            <w:webHidden/>
-          </w:rPr>
-          <w:fldChar w:fldCharType="separate"/>
-        </w:r>
-        <w:r>
-          <w:rPr>
-            <w:noProof/>
-            <w:webHidden/>
-          </w:rPr>
-          <w:t>2</w:t>
-        </w:r>
-        <w:r>
-          <w:rPr>
-            <w:noProof/>
-            <w:webHidden/>
-          </w:rPr>
-          <w:fldChar w:fldCharType="end"/>
-        </w:r>
-      </w:hyperlink>
-    </w:p>
-    <w:p>
-      <w:pPr>
-        <w:pStyle w:val="INNH2"/>
-        <w:tabs>
-          <w:tab w:val="left" w:pos="960"/>
-          <w:tab w:val="right" w:leader="dot" w:pos="8758"/>
-        </w:tabs>
-        <w:rPr>
-          <w:rFonts w:asciiTheme="minorHAnsi" w:eastAsiaTheme="minorEastAsia" w:hAnsiTheme="minorHAnsi" w:cstheme="minorBidi"/>
-          <w:noProof/>
-          <w:kern w:val="2"/>
-          <w:lang w:val="en-GB" w:eastAsia="en-GB" w:bidi="ar-SA"/>
-          <w14:ligatures w14:val="standardContextual"/>
-        </w:rPr>
-      </w:pPr>
-      <w:hyperlink w:anchor="_Toc222057405" w:history="1">
-        <w:r>
-          <w:rPr>
-            <w:rStyle w:val="Hyperkobling"/>
-            <w:noProof/>
-          </w:rPr>
-          <w:t>1.2</w:t>
-        </w:r>
-        <w:r>
-          <w:rPr>
-            <w:rFonts w:asciiTheme="minorHAnsi" w:eastAsiaTheme="minorEastAsia" w:hAnsiTheme="minorHAnsi" w:cstheme="minorBidi"/>
-            <w:noProof/>
-            <w:kern w:val="2"/>
-            <w:lang w:val="en-GB" w:eastAsia="en-GB" w:bidi="ar-SA"/>
-            <w14:ligatures w14:val="standardContextual"/>
-          </w:rPr>
-          <w:tab/>
-        </w:r>
-        <w:r>
-          <w:rPr>
-            <w:rStyle w:val="Hyperkobling"/>
-            <w:noProof/>
-          </w:rPr>
-          <w:t>Delproblemer (valgfri)</w:t>
-        </w:r>
-        <w:r>
-          <w:rPr>
-            <w:noProof/>
-            <w:webHidden/>
-          </w:rPr>
-          <w:tab/>
-        </w:r>
-        <w:r>
-          <w:rPr>
-            <w:noProof/>
-            <w:webHidden/>
-          </w:rPr>
-          <w:fldChar w:fldCharType="begin"/>
-        </w:r>
-        <w:r>
-          <w:rPr>
-            <w:noProof/>
-            <w:webHidden/>
-          </w:rPr>
-          <w:instrText xml:space="preserve"> PAGEREF _Toc222057405 \h </w:instrText>
-        </w:r>
-        <w:r>
-          <w:rPr>
-            <w:noProof/>
-            <w:webHidden/>
-          </w:rPr>
-        </w:r>
-        <w:r>
-          <w:rPr>
-            <w:noProof/>
-            <w:webHidden/>
-          </w:rPr>
-          <w:fldChar w:fldCharType="separate"/>
-        </w:r>
-        <w:r>
-          <w:rPr>
-            <w:noProof/>
-            <w:webHidden/>
-          </w:rPr>
-          <w:t>2</w:t>
-        </w:r>
-        <w:r>
-          <w:rPr>
-            <w:noProof/>
-            <w:webHidden/>
-          </w:rPr>
-          <w:fldChar w:fldCharType="end"/>
-        </w:r>
-      </w:hyperlink>
-    </w:p>
-    <w:p>
-      <w:pPr>
-        <w:pStyle w:val="INNH2"/>
-        <w:tabs>
-          <w:tab w:val="left" w:pos="960"/>
-          <w:tab w:val="right" w:leader="dot" w:pos="8758"/>
-        </w:tabs>
-        <w:rPr>
-          <w:rFonts w:asciiTheme="minorHAnsi" w:eastAsiaTheme="minorEastAsia" w:hAnsiTheme="minorHAnsi" w:cstheme="minorBidi"/>
-          <w:noProof/>
-          <w:kern w:val="2"/>
-          <w:lang w:val="en-GB" w:eastAsia="en-GB" w:bidi="ar-SA"/>
-          <w14:ligatures w14:val="standardContextual"/>
-        </w:rPr>
-      </w:pPr>
-      <w:hyperlink w:anchor="_Toc222057406" w:history="1">
-        <w:r>
-          <w:rPr>
-            <w:rStyle w:val="Hyperkobling"/>
-            <w:noProof/>
-          </w:rPr>
-          <w:t>1.3</w:t>
-        </w:r>
-        <w:r>
-          <w:rPr>
-            <w:rFonts w:asciiTheme="minorHAnsi" w:eastAsiaTheme="minorEastAsia" w:hAnsiTheme="minorHAnsi" w:cstheme="minorBidi"/>
-            <w:noProof/>
-            <w:kern w:val="2"/>
-            <w:lang w:val="en-GB" w:eastAsia="en-GB" w:bidi="ar-SA"/>
-            <w14:ligatures w14:val="standardContextual"/>
-          </w:rPr>
-          <w:tab/>
-        </w:r>
-        <w:r>
-          <w:rPr>
-            <w:rStyle w:val="Hyperkobling"/>
-            <w:noProof/>
-          </w:rPr>
-          <w:t>Avgrensinger</w:t>
-        </w:r>
-        <w:r>
-          <w:rPr>
-            <w:noProof/>
-            <w:webHidden/>
-          </w:rPr>
-          <w:tab/>
-        </w:r>
-        <w:r>
-          <w:rPr>
-            <w:noProof/>
-            <w:webHidden/>
-          </w:rPr>
-          <w:fldChar w:fldCharType="begin"/>
-        </w:r>
-        <w:r>
-          <w:rPr>
-            <w:noProof/>
-            <w:webHidden/>
-          </w:rPr>
-          <w:instrText xml:space="preserve"> PAGEREF _Toc222057406 \h </w:instrText>
-        </w:r>
-        <w:r>
-          <w:rPr>
-            <w:noProof/>
-            <w:webHidden/>
-          </w:rPr>
-        </w:r>
-        <w:r>
-          <w:rPr>
-            <w:noProof/>
-            <w:webHidden/>
-          </w:rPr>
-          <w:fldChar w:fldCharType="separate"/>
-        </w:r>
-        <w:r>
-          <w:rPr>
-            <w:noProof/>
-            <w:webHidden/>
-          </w:rPr>
-          <w:t>2</w:t>
-        </w:r>
-        <w:r>
-          <w:rPr>
-            <w:noProof/>
-            <w:webHidden/>
-          </w:rPr>
-          <w:fldChar w:fldCharType="end"/>
-        </w:r>
-      </w:hyperlink>
-    </w:p>
-    <w:p>
-      <w:pPr>
-        <w:pStyle w:val="INNH2"/>
-        <w:tabs>
-          <w:tab w:val="left" w:pos="960"/>
-          <w:tab w:val="right" w:leader="dot" w:pos="8758"/>
-        </w:tabs>
-        <w:rPr>
-          <w:rFonts w:asciiTheme="minorHAnsi" w:eastAsiaTheme="minorEastAsia" w:hAnsiTheme="minorHAnsi" w:cstheme="minorBidi"/>
-          <w:noProof/>
-          <w:kern w:val="2"/>
-          <w:lang w:val="en-GB" w:eastAsia="en-GB" w:bidi="ar-SA"/>
-          <w14:ligatures w14:val="standardContextual"/>
-        </w:rPr>
-      </w:pPr>
-      <w:hyperlink w:anchor="_Toc222057407" w:history="1">
-        <w:r>
-          <w:rPr>
-            <w:rStyle w:val="Hyperkobling"/>
-            <w:noProof/>
-          </w:rPr>
-          <w:t>1.4</w:t>
-        </w:r>
-        <w:r>
-          <w:rPr>
-            <w:rFonts w:asciiTheme="minorHAnsi" w:eastAsiaTheme="minorEastAsia" w:hAnsiTheme="minorHAnsi" w:cstheme="minorBidi"/>
-            <w:noProof/>
-            <w:kern w:val="2"/>
-            <w:lang w:val="en-GB" w:eastAsia="en-GB" w:bidi="ar-SA"/>
-            <w14:ligatures w14:val="standardContextual"/>
-          </w:rPr>
-          <w:tab/>
-        </w:r>
-        <w:r>
-          <w:rPr>
-            <w:rStyle w:val="Hyperkobling"/>
-            <w:noProof/>
-          </w:rPr>
-          <w:t>Antagelser</w:t>
-        </w:r>
-        <w:r>
-          <w:rPr>
-            <w:noProof/>
-            <w:webHidden/>
-          </w:rPr>
-          <w:tab/>
-        </w:r>
-        <w:r>
-          <w:rPr>
-            <w:noProof/>
-            <w:webHidden/>
-          </w:rPr>
-          <w:fldChar w:fldCharType="begin"/>
-        </w:r>
-        <w:r>
-          <w:rPr>
-            <w:noProof/>
-            <w:webHidden/>
-          </w:rPr>
-          <w:instrText xml:space="preserve"> PAGEREF _Toc222057407 \h </w:instrText>
-        </w:r>
-        <w:r>
-          <w:rPr>
-            <w:noProof/>
-            <w:webHidden/>
-          </w:rPr>
-        </w:r>
-        <w:r>
-          <w:rPr>
-            <w:noProof/>
-            <w:webHidden/>
-          </w:rPr>
-          <w:fldChar w:fldCharType="separate"/>
-        </w:r>
-        <w:r>
-          <w:rPr>
-            <w:noProof/>
-            <w:webHidden/>
-          </w:rPr>
-          <w:t>3</w:t>
-        </w:r>
-        <w:r>
-          <w:rPr>
-            <w:noProof/>
-            <w:webHidden/>
-          </w:rPr>
-          <w:fldChar w:fldCharType="end"/>
-        </w:r>
-      </w:hyperlink>
-    </w:p>
-    <w:p>
-      <w:pPr>
-        <w:pStyle w:val="INNH1"/>
-        <w:tabs>
-          <w:tab w:val="left" w:pos="720"/>
-        </w:tabs>
-        <w:rPr>
-          <w:rFonts w:asciiTheme="minorHAnsi" w:eastAsiaTheme="minorEastAsia" w:hAnsiTheme="minorHAnsi" w:cstheme="minorBidi"/>
-          <w:b w:val="0"/>
-          <w:kern w:val="2"/>
-          <w:lang w:val="en-GB" w:eastAsia="en-GB" w:bidi="ar-SA"/>
-          <w14:ligatures w14:val="standardContextual"/>
-        </w:rPr>
-      </w:pPr>
-      <w:hyperlink w:anchor="_Toc222057408" w:history="1">
-        <w:r>
-          <w:rPr>
-            <w:rStyle w:val="Hyperkobling"/>
-          </w:rPr>
-          <w:t>2.0</w:t>
-        </w:r>
-        <w:r>
-          <w:rPr>
-            <w:rFonts w:asciiTheme="minorHAnsi" w:eastAsiaTheme="minorEastAsia" w:hAnsiTheme="minorHAnsi" w:cstheme="minorBidi"/>
-            <w:b w:val="0"/>
-            <w:kern w:val="2"/>
-            <w:lang w:val="en-GB" w:eastAsia="en-GB" w:bidi="ar-SA"/>
-            <w14:ligatures w14:val="standardContextual"/>
-          </w:rPr>
-          <w:tab/>
-        </w:r>
-        <w:r>
-          <w:rPr>
-            <w:rStyle w:val="Hyperkobling"/>
-          </w:rPr>
-          <w:t>Litteratur</w:t>
-        </w:r>
-        <w:r>
-          <w:rPr>
-            <w:webHidden/>
-          </w:rPr>
-          <w:tab/>
-        </w:r>
-        <w:r>
-          <w:rPr>
-            <w:webHidden/>
-          </w:rPr>
-          <w:fldChar w:fldCharType="begin"/>
-        </w:r>
-        <w:r>
-          <w:rPr>
-            <w:webHidden/>
-          </w:rPr>
-          <w:instrText xml:space="preserve"> PAGEREF _Toc222057408 \h </w:instrText>
-        </w:r>
-        <w:r>
-          <w:rPr>
-            <w:webHidden/>
-          </w:rPr>
-        </w:r>
-        <w:r>
-          <w:rPr>
-            <w:webHidden/>
-          </w:rPr>
-          <w:fldChar w:fldCharType="separate"/>
-        </w:r>
-        <w:r>
-          <w:rPr>
-            <w:webHidden/>
-          </w:rPr>
-          <w:t>3</w:t>
-        </w:r>
-        <w:r>
-          <w:rPr>
-            <w:webHidden/>
-          </w:rPr>
-          <w:fldChar w:fldCharType="end"/>
-        </w:r>
-      </w:hyperlink>
-    </w:p>
-    <w:p>
-      <w:pPr>
-        <w:pStyle w:val="INNH1"/>
-        <w:tabs>
-          <w:tab w:val="left" w:pos="720"/>
-        </w:tabs>
-        <w:rPr>
-          <w:rFonts w:asciiTheme="minorHAnsi" w:eastAsiaTheme="minorEastAsia" w:hAnsiTheme="minorHAnsi" w:cstheme="minorBidi"/>
-          <w:b w:val="0"/>
-          <w:kern w:val="2"/>
-          <w:lang w:val="en-GB" w:eastAsia="en-GB" w:bidi="ar-SA"/>
-          <w14:ligatures w14:val="standardContextual"/>
-        </w:rPr>
-      </w:pPr>
-      <w:hyperlink w:anchor="_Toc222057409" w:history="1">
-        <w:r>
-          <w:rPr>
-            <w:rStyle w:val="Hyperkobling"/>
-          </w:rPr>
-          <w:t>3.0</w:t>
-        </w:r>
-        <w:r>
-          <w:rPr>
-            <w:rFonts w:asciiTheme="minorHAnsi" w:eastAsiaTheme="minorEastAsia" w:hAnsiTheme="minorHAnsi" w:cstheme="minorBidi"/>
-            <w:b w:val="0"/>
-            <w:kern w:val="2"/>
-            <w:lang w:val="en-GB" w:eastAsia="en-GB" w:bidi="ar-SA"/>
-            <w14:ligatures w14:val="standardContextual"/>
-          </w:rPr>
-          <w:tab/>
-        </w:r>
-        <w:r>
-          <w:rPr>
-            <w:rStyle w:val="Hyperkobling"/>
-          </w:rPr>
-          <w:t>Teori</w:t>
-        </w:r>
-        <w:r>
-          <w:rPr>
-            <w:webHidden/>
-          </w:rPr>
-          <w:tab/>
-        </w:r>
-        <w:r>
-          <w:rPr>
-            <w:webHidden/>
-          </w:rPr>
-          <w:fldChar w:fldCharType="begin"/>
-        </w:r>
-        <w:r>
-          <w:rPr>
-            <w:webHidden/>
-          </w:rPr>
-          <w:instrText xml:space="preserve"> PAGEREF _Toc222057409 \h </w:instrText>
-        </w:r>
-        <w:r>
-          <w:rPr>
-            <w:webHidden/>
-          </w:rPr>
-        </w:r>
-        <w:r>
-          <w:rPr>
-            <w:webHidden/>
-          </w:rPr>
-          <w:fldChar w:fldCharType="separate"/>
-        </w:r>
-        <w:r>
-          <w:rPr>
-            <w:webHidden/>
-          </w:rPr>
-          <w:t>3</w:t>
-        </w:r>
-        <w:r>
-          <w:rPr>
-            <w:webHidden/>
-          </w:rPr>
-          <w:fldChar w:fldCharType="end"/>
-        </w:r>
-      </w:hyperlink>
-    </w:p>
-    <w:p>
-      <w:pPr>
-        <w:pStyle w:val="INNH1"/>
-        <w:tabs>
-          <w:tab w:val="left" w:pos="720"/>
-        </w:tabs>
-        <w:rPr>
-          <w:rFonts w:asciiTheme="minorHAnsi" w:eastAsiaTheme="minorEastAsia" w:hAnsiTheme="minorHAnsi" w:cstheme="minorBidi"/>
-          <w:b w:val="0"/>
-          <w:kern w:val="2"/>
-          <w:lang w:val="en-GB" w:eastAsia="en-GB" w:bidi="ar-SA"/>
-          <w14:ligatures w14:val="standardContextual"/>
-        </w:rPr>
-      </w:pPr>
-      <w:hyperlink w:anchor="_Toc222057410" w:history="1">
-        <w:r>
-          <w:rPr>
-            <w:rStyle w:val="Hyperkobling"/>
-          </w:rPr>
-          <w:t>4.0</w:t>
-        </w:r>
-        <w:r>
-          <w:rPr>
-            <w:rFonts w:asciiTheme="minorHAnsi" w:eastAsiaTheme="minorEastAsia" w:hAnsiTheme="minorHAnsi" w:cstheme="minorBidi"/>
-            <w:b w:val="0"/>
-            <w:kern w:val="2"/>
-            <w:lang w:val="en-GB" w:eastAsia="en-GB" w:bidi="ar-SA"/>
-            <w14:ligatures w14:val="standardContextual"/>
-          </w:rPr>
-          <w:tab/>
-        </w:r>
-        <w:r>
-          <w:rPr>
-            <w:rStyle w:val="Hyperkobling"/>
-          </w:rPr>
-          <w:t>Casebeskrivelse</w:t>
-        </w:r>
-        <w:r>
-          <w:rPr>
-            <w:webHidden/>
-          </w:rPr>
-          <w:tab/>
-        </w:r>
-        <w:r>
-          <w:rPr>
-            <w:webHidden/>
-          </w:rPr>
-          <w:fldChar w:fldCharType="begin"/>
-        </w:r>
-        <w:r>
-          <w:rPr>
-            <w:webHidden/>
-          </w:rPr>
-          <w:instrText xml:space="preserve"> PAGEREF _Toc222057410 \h </w:instrText>
-        </w:r>
-        <w:r>
-          <w:rPr>
-            <w:webHidden/>
-          </w:rPr>
-        </w:r>
-        <w:r>
-          <w:rPr>
-            <w:webHidden/>
-          </w:rPr>
-          <w:fldChar w:fldCharType="separate"/>
-        </w:r>
-        <w:r>
-          <w:rPr>
-            <w:webHidden/>
-          </w:rPr>
-          <w:t>4</w:t>
-        </w:r>
-        <w:r>
-          <w:rPr>
-            <w:webHidden/>
-          </w:rPr>
-          <w:fldChar w:fldCharType="end"/>
-        </w:r>
-      </w:hyperlink>
-    </w:p>
-    <w:p>
-      <w:pPr>
-        <w:pStyle w:val="INNH1"/>
-        <w:tabs>
-          <w:tab w:val="left" w:pos="720"/>
-        </w:tabs>
-        <w:rPr>
-          <w:rFonts w:asciiTheme="minorHAnsi" w:eastAsiaTheme="minorEastAsia" w:hAnsiTheme="minorHAnsi" w:cstheme="minorBidi"/>
-          <w:b w:val="0"/>
-          <w:kern w:val="2"/>
-          <w:lang w:val="en-GB" w:eastAsia="en-GB" w:bidi="ar-SA"/>
-          <w14:ligatures w14:val="standardContextual"/>
-        </w:rPr>
-      </w:pPr>
-      <w:hyperlink w:anchor="_Toc222057411" w:history="1">
-        <w:r>
-          <w:rPr>
-            <w:rStyle w:val="Hyperkobling"/>
-          </w:rPr>
-          <w:t>5.0</w:t>
-        </w:r>
-        <w:r>
-          <w:rPr>
-            <w:rFonts w:asciiTheme="minorHAnsi" w:eastAsiaTheme="minorEastAsia" w:hAnsiTheme="minorHAnsi" w:cstheme="minorBidi"/>
-            <w:b w:val="0"/>
-            <w:kern w:val="2"/>
-            <w:lang w:val="en-GB" w:eastAsia="en-GB" w:bidi="ar-SA"/>
-            <w14:ligatures w14:val="standardContextual"/>
-          </w:rPr>
-          <w:tab/>
-        </w:r>
-        <w:r>
-          <w:rPr>
-            <w:rStyle w:val="Hyperkobling"/>
-          </w:rPr>
-          <w:t>Metode og data (kan splittes i to)</w:t>
-        </w:r>
-        <w:r>
-          <w:rPr>
-            <w:webHidden/>
-          </w:rPr>
-          <w:tab/>
-        </w:r>
-        <w:r>
-          <w:rPr>
-            <w:webHidden/>
-          </w:rPr>
-          <w:fldChar w:fldCharType="begin"/>
-        </w:r>
-        <w:r>
-          <w:rPr>
-            <w:webHidden/>
-          </w:rPr>
-          <w:instrText xml:space="preserve"> PAGEREF _Toc222057411 \h </w:instrText>
-        </w:r>
-        <w:r>
-          <w:rPr>
-            <w:webHidden/>
-          </w:rPr>
-        </w:r>
-        <w:r>
-          <w:rPr>
-            <w:webHidden/>
-          </w:rPr>
-          <w:fldChar w:fldCharType="separate"/>
-        </w:r>
-        <w:r>
-          <w:rPr>
-            <w:webHidden/>
-          </w:rPr>
-          <w:t>4</w:t>
-        </w:r>
-        <w:r>
-          <w:rPr>
-            <w:webHidden/>
-          </w:rPr>
-          <w:fldChar w:fldCharType="end"/>
-        </w:r>
-      </w:hyperlink>
-    </w:p>
-    <w:p>
-      <w:pPr>
-        <w:pStyle w:val="INNH2"/>
-        <w:tabs>
-          <w:tab w:val="left" w:pos="960"/>
-          <w:tab w:val="right" w:leader="dot" w:pos="8758"/>
-        </w:tabs>
-        <w:rPr>
-          <w:rFonts w:asciiTheme="minorHAnsi" w:eastAsiaTheme="minorEastAsia" w:hAnsiTheme="minorHAnsi" w:cstheme="minorBidi"/>
-          <w:noProof/>
-          <w:kern w:val="2"/>
-          <w:lang w:val="en-GB" w:eastAsia="en-GB" w:bidi="ar-SA"/>
-          <w14:ligatures w14:val="standardContextual"/>
-        </w:rPr>
-      </w:pPr>
-      <w:hyperlink w:anchor="_Toc222057412" w:history="1">
-        <w:r>
-          <w:rPr>
-            <w:rStyle w:val="Hyperkobling"/>
-            <w:noProof/>
-          </w:rPr>
-          <w:t>5.1</w:t>
-        </w:r>
-        <w:r>
-          <w:rPr>
-            <w:rFonts w:asciiTheme="minorHAnsi" w:eastAsiaTheme="minorEastAsia" w:hAnsiTheme="minorHAnsi" w:cstheme="minorBidi"/>
-            <w:noProof/>
-            <w:kern w:val="2"/>
-            <w:lang w:val="en-GB" w:eastAsia="en-GB" w:bidi="ar-SA"/>
-            <w14:ligatures w14:val="standardContextual"/>
-          </w:rPr>
-          <w:tab/>
-        </w:r>
-        <w:r>
-          <w:rPr>
-            <w:rStyle w:val="Hyperkobling"/>
-            <w:noProof/>
-          </w:rPr>
-          <w:t>Metode</w:t>
-        </w:r>
-        <w:r>
-          <w:rPr>
-            <w:noProof/>
-            <w:webHidden/>
-          </w:rPr>
-          <w:tab/>
-        </w:r>
-        <w:r>
-          <w:rPr>
-            <w:noProof/>
-            <w:webHidden/>
-          </w:rPr>
-          <w:fldChar w:fldCharType="begin"/>
-        </w:r>
-        <w:r>
-          <w:rPr>
-            <w:noProof/>
-            <w:webHidden/>
-          </w:rPr>
-          <w:instrText xml:space="preserve"> PAGEREF _Toc222057412 \h </w:instrText>
-        </w:r>
-        <w:r>
-          <w:rPr>
-            <w:noProof/>
-            <w:webHidden/>
-          </w:rPr>
-        </w:r>
-        <w:r>
-          <w:rPr>
-            <w:noProof/>
-            <w:webHidden/>
-          </w:rPr>
-          <w:fldChar w:fldCharType="separate"/>
-        </w:r>
-        <w:r>
-          <w:rPr>
-            <w:noProof/>
-            <w:webHidden/>
-          </w:rPr>
-          <w:t>4</w:t>
-        </w:r>
-        <w:r>
-          <w:rPr>
-            <w:noProof/>
-            <w:webHidden/>
-          </w:rPr>
-          <w:fldChar w:fldCharType="end"/>
-        </w:r>
-      </w:hyperlink>
-    </w:p>
-    <w:p>
-      <w:pPr>
-        <w:pStyle w:val="INNH2"/>
-        <w:tabs>
-          <w:tab w:val="left" w:pos="960"/>
-          <w:tab w:val="right" w:leader="dot" w:pos="8758"/>
-        </w:tabs>
-        <w:rPr>
-          <w:rFonts w:asciiTheme="minorHAnsi" w:eastAsiaTheme="minorEastAsia" w:hAnsiTheme="minorHAnsi" w:cstheme="minorBidi"/>
-          <w:noProof/>
-          <w:kern w:val="2"/>
-          <w:lang w:val="en-GB" w:eastAsia="en-GB" w:bidi="ar-SA"/>
-          <w14:ligatures w14:val="standardContextual"/>
-        </w:rPr>
-      </w:pPr>
-      <w:hyperlink w:anchor="_Toc222057413" w:history="1">
-        <w:r>
-          <w:rPr>
-            <w:rStyle w:val="Hyperkobling"/>
-            <w:noProof/>
-          </w:rPr>
-          <w:t>5.2</w:t>
-        </w:r>
-        <w:r>
-          <w:rPr>
-            <w:rFonts w:asciiTheme="minorHAnsi" w:eastAsiaTheme="minorEastAsia" w:hAnsiTheme="minorHAnsi" w:cstheme="minorBidi"/>
-            <w:noProof/>
-            <w:kern w:val="2"/>
-            <w:lang w:val="en-GB" w:eastAsia="en-GB" w:bidi="ar-SA"/>
-            <w14:ligatures w14:val="standardContextual"/>
-          </w:rPr>
-          <w:tab/>
-        </w:r>
-        <w:r>
-          <w:rPr>
-            <w:rStyle w:val="Hyperkobling"/>
-            <w:noProof/>
-          </w:rPr>
-          <w:t>Data</w:t>
-        </w:r>
-        <w:r>
-          <w:rPr>
-            <w:noProof/>
-            <w:webHidden/>
-          </w:rPr>
-          <w:tab/>
-        </w:r>
-        <w:r>
-          <w:rPr>
-            <w:noProof/>
-            <w:webHidden/>
-          </w:rPr>
-          <w:fldChar w:fldCharType="begin"/>
-        </w:r>
-        <w:r>
-          <w:rPr>
-            <w:noProof/>
-            <w:webHidden/>
-          </w:rPr>
-          <w:instrText xml:space="preserve"> PAGEREF _Toc222057413 \h </w:instrText>
-        </w:r>
-        <w:r>
-          <w:rPr>
-            <w:noProof/>
-            <w:webHidden/>
-          </w:rPr>
-        </w:r>
-        <w:r>
-          <w:rPr>
-            <w:noProof/>
-            <w:webHidden/>
-          </w:rPr>
-          <w:fldChar w:fldCharType="separate"/>
-        </w:r>
-        <w:r>
-          <w:rPr>
-            <w:noProof/>
-            <w:webHidden/>
-          </w:rPr>
-          <w:t>5</w:t>
-        </w:r>
-        <w:r>
-          <w:rPr>
-            <w:noProof/>
-            <w:webHidden/>
-          </w:rPr>
-          <w:fldChar w:fldCharType="end"/>
-        </w:r>
-      </w:hyperlink>
-    </w:p>
-    <w:p>
-      <w:pPr>
-        <w:pStyle w:val="INNH1"/>
-        <w:tabs>
-          <w:tab w:val="left" w:pos="720"/>
-        </w:tabs>
-        <w:rPr>
-          <w:rFonts w:asciiTheme="minorHAnsi" w:eastAsiaTheme="minorEastAsia" w:hAnsiTheme="minorHAnsi" w:cstheme="minorBidi"/>
-          <w:b w:val="0"/>
-          <w:kern w:val="2"/>
-          <w:lang w:val="en-GB" w:eastAsia="en-GB" w:bidi="ar-SA"/>
-          <w14:ligatures w14:val="standardContextual"/>
-        </w:rPr>
-      </w:pPr>
-      <w:hyperlink w:anchor="_Toc222057414" w:history="1">
-        <w:r>
-          <w:rPr>
-            <w:rStyle w:val="Hyperkobling"/>
-          </w:rPr>
-          <w:t>6.0</w:t>
-        </w:r>
-        <w:r>
-          <w:rPr>
-            <w:rFonts w:asciiTheme="minorHAnsi" w:eastAsiaTheme="minorEastAsia" w:hAnsiTheme="minorHAnsi" w:cstheme="minorBidi"/>
-            <w:b w:val="0"/>
-            <w:kern w:val="2"/>
-            <w:lang w:val="en-GB" w:eastAsia="en-GB" w:bidi="ar-SA"/>
-            <w14:ligatures w14:val="standardContextual"/>
-          </w:rPr>
-          <w:tab/>
-        </w:r>
-        <w:r>
-          <w:rPr>
-            <w:rStyle w:val="Hyperkobling"/>
-          </w:rPr>
-          <w:t>Modellering</w:t>
-        </w:r>
-        <w:r>
-          <w:rPr>
-            <w:webHidden/>
-          </w:rPr>
-          <w:tab/>
-        </w:r>
-        <w:r>
-          <w:rPr>
-            <w:webHidden/>
-          </w:rPr>
-          <w:fldChar w:fldCharType="begin"/>
-        </w:r>
-        <w:r>
-          <w:rPr>
-            <w:webHidden/>
-          </w:rPr>
-          <w:instrText xml:space="preserve"> PAGEREF _Toc222057414 \h </w:instrText>
-        </w:r>
-        <w:r>
-          <w:rPr>
-            <w:webHidden/>
-          </w:rPr>
-        </w:r>
-        <w:r>
-          <w:rPr>
-            <w:webHidden/>
-          </w:rPr>
-          <w:fldChar w:fldCharType="separate"/>
-        </w:r>
-        <w:r>
-          <w:rPr>
-            <w:webHidden/>
-          </w:rPr>
-          <w:t>6</w:t>
-        </w:r>
-        <w:r>
-          <w:rPr>
-            <w:webHidden/>
-          </w:rPr>
-          <w:fldChar w:fldCharType="end"/>
-        </w:r>
-      </w:hyperlink>
-    </w:p>
-    <w:p>
-      <w:pPr>
-        <w:pStyle w:val="INNH1"/>
-        <w:tabs>
-          <w:tab w:val="left" w:pos="720"/>
-        </w:tabs>
-        <w:rPr>
-          <w:rFonts w:asciiTheme="minorHAnsi" w:eastAsiaTheme="minorEastAsia" w:hAnsiTheme="minorHAnsi" w:cstheme="minorBidi"/>
-          <w:b w:val="0"/>
-          <w:kern w:val="2"/>
-          <w:lang w:val="en-GB" w:eastAsia="en-GB" w:bidi="ar-SA"/>
-          <w14:ligatures w14:val="standardContextual"/>
-        </w:rPr>
-      </w:pPr>
-      <w:hyperlink w:anchor="_Toc222057415" w:history="1">
-        <w:r>
-          <w:rPr>
-            <w:rStyle w:val="Hyperkobling"/>
-          </w:rPr>
-          <w:t>7.0</w:t>
-        </w:r>
-        <w:r>
-          <w:rPr>
-            <w:rFonts w:asciiTheme="minorHAnsi" w:eastAsiaTheme="minorEastAsia" w:hAnsiTheme="minorHAnsi" w:cstheme="minorBidi"/>
-            <w:b w:val="0"/>
-            <w:kern w:val="2"/>
-            <w:lang w:val="en-GB" w:eastAsia="en-GB" w:bidi="ar-SA"/>
-            <w14:ligatures w14:val="standardContextual"/>
-          </w:rPr>
-          <w:tab/>
-        </w:r>
-        <w:r>
-          <w:rPr>
-            <w:rStyle w:val="Hyperkobling"/>
-          </w:rPr>
-          <w:t>Analyse</w:t>
-        </w:r>
-        <w:r>
-          <w:rPr>
-            <w:webHidden/>
-          </w:rPr>
-          <w:tab/>
-        </w:r>
-        <w:r>
-          <w:rPr>
-            <w:webHidden/>
-          </w:rPr>
-          <w:fldChar w:fldCharType="begin"/>
-        </w:r>
-        <w:r>
-          <w:rPr>
-            <w:webHidden/>
-          </w:rPr>
-          <w:instrText xml:space="preserve"> PAGEREF _Toc222057415 \h </w:instrText>
-        </w:r>
-        <w:r>
-          <w:rPr>
-            <w:webHidden/>
-          </w:rPr>
-        </w:r>
-        <w:r>
-          <w:rPr>
-            <w:webHidden/>
-          </w:rPr>
-          <w:fldChar w:fldCharType="separate"/>
-        </w:r>
-        <w:r>
-          <w:rPr>
-            <w:webHidden/>
-          </w:rPr>
-          <w:t>6</w:t>
-        </w:r>
-        <w:r>
-          <w:rPr>
-            <w:webHidden/>
-          </w:rPr>
-          <w:fldChar w:fldCharType="end"/>
-        </w:r>
-      </w:hyperlink>
-    </w:p>
-    <w:p>
-      <w:pPr>
-        <w:pStyle w:val="INNH1"/>
-        <w:tabs>
-          <w:tab w:val="left" w:pos="720"/>
-        </w:tabs>
-        <w:rPr>
-          <w:rFonts w:asciiTheme="minorHAnsi" w:eastAsiaTheme="minorEastAsia" w:hAnsiTheme="minorHAnsi" w:cstheme="minorBidi"/>
-          <w:b w:val="0"/>
-          <w:kern w:val="2"/>
-          <w:lang w:val="en-GB" w:eastAsia="en-GB" w:bidi="ar-SA"/>
-          <w14:ligatures w14:val="standardContextual"/>
-        </w:rPr>
-      </w:pPr>
-      <w:hyperlink w:anchor="_Toc222057416" w:history="1">
-        <w:r>
-          <w:rPr>
-            <w:rStyle w:val="Hyperkobling"/>
-          </w:rPr>
-          <w:t>8.0</w:t>
-        </w:r>
-        <w:r>
-          <w:rPr>
-            <w:rFonts w:asciiTheme="minorHAnsi" w:eastAsiaTheme="minorEastAsia" w:hAnsiTheme="minorHAnsi" w:cstheme="minorBidi"/>
-            <w:b w:val="0"/>
-            <w:kern w:val="2"/>
-            <w:lang w:val="en-GB" w:eastAsia="en-GB" w:bidi="ar-SA"/>
-            <w14:ligatures w14:val="standardContextual"/>
-          </w:rPr>
-          <w:tab/>
-        </w:r>
-        <w:r>
-          <w:rPr>
-            <w:rStyle w:val="Hyperkobling"/>
-          </w:rPr>
-          <w:t>Resultat</w:t>
-        </w:r>
-        <w:r>
-          <w:rPr>
-            <w:webHidden/>
-          </w:rPr>
-          <w:tab/>
-        </w:r>
-        <w:r>
-          <w:rPr>
-            <w:webHidden/>
-          </w:rPr>
-          <w:fldChar w:fldCharType="begin"/>
-        </w:r>
-        <w:r>
-          <w:rPr>
-            <w:webHidden/>
-          </w:rPr>
-          <w:instrText xml:space="preserve"> PAGEREF _Toc222057416 \h </w:instrText>
-        </w:r>
-        <w:r>
-          <w:rPr>
-            <w:webHidden/>
-          </w:rPr>
-        </w:r>
-        <w:r>
-          <w:rPr>
-            <w:webHidden/>
-          </w:rPr>
-          <w:fldChar w:fldCharType="separate"/>
-        </w:r>
-        <w:r>
-          <w:rPr>
-            <w:webHidden/>
-          </w:rPr>
-          <w:t>6</w:t>
-        </w:r>
-        <w:r>
-          <w:rPr>
-            <w:webHidden/>
-          </w:rPr>
-          <w:fldChar w:fldCharType="end"/>
-        </w:r>
-      </w:hyperlink>
-    </w:p>
-    <w:p>
-      <w:pPr>
-        <w:pStyle w:val="INNH1"/>
-        <w:tabs>
-          <w:tab w:val="left" w:pos="720"/>
-        </w:tabs>
-        <w:rPr>
-          <w:rFonts w:asciiTheme="minorHAnsi" w:eastAsiaTheme="minorEastAsia" w:hAnsiTheme="minorHAnsi" w:cstheme="minorBidi"/>
-          <w:b w:val="0"/>
-          <w:kern w:val="2"/>
-          <w:lang w:val="en-GB" w:eastAsia="en-GB" w:bidi="ar-SA"/>
-          <w14:ligatures w14:val="standardContextual"/>
-        </w:rPr>
-      </w:pPr>
-      <w:hyperlink w:anchor="_Toc222057417" w:history="1">
-        <w:r>
-          <w:rPr>
-            <w:rStyle w:val="Hyperkobling"/>
-          </w:rPr>
-          <w:t>9.0</w:t>
-        </w:r>
-        <w:r>
-          <w:rPr>
-            <w:rFonts w:asciiTheme="minorHAnsi" w:eastAsiaTheme="minorEastAsia" w:hAnsiTheme="minorHAnsi" w:cstheme="minorBidi"/>
-            <w:b w:val="0"/>
-            <w:kern w:val="2"/>
-            <w:lang w:val="en-GB" w:eastAsia="en-GB" w:bidi="ar-SA"/>
-            <w14:ligatures w14:val="standardContextual"/>
-          </w:rPr>
-          <w:tab/>
-        </w:r>
-        <w:r>
-          <w:rPr>
-            <w:rStyle w:val="Hyperkobling"/>
-          </w:rPr>
-          <w:t>Diskusjon</w:t>
-        </w:r>
-        <w:r>
-          <w:rPr>
-            <w:webHidden/>
-          </w:rPr>
-          <w:tab/>
-        </w:r>
-        <w:r>
-          <w:rPr>
-            <w:webHidden/>
-          </w:rPr>
-          <w:fldChar w:fldCharType="begin"/>
-        </w:r>
-        <w:r>
-          <w:rPr>
-            <w:webHidden/>
-          </w:rPr>
-          <w:instrText xml:space="preserve"> PAGEREF _Toc222057417 \h </w:instrText>
-        </w:r>
-        <w:r>
-          <w:rPr>
-            <w:webHidden/>
-          </w:rPr>
-        </w:r>
-        <w:r>
-          <w:rPr>
-            <w:webHidden/>
-          </w:rPr>
-          <w:fldChar w:fldCharType="separate"/>
-        </w:r>
-        <w:r>
-          <w:rPr>
-            <w:webHidden/>
-          </w:rPr>
-          <w:t>7</w:t>
-        </w:r>
-        <w:r>
-          <w:rPr>
-            <w:webHidden/>
-          </w:rPr>
-          <w:fldChar w:fldCharType="end"/>
-        </w:r>
-      </w:hyperlink>
-    </w:p>
-    <w:p>
-      <w:pPr>
-        <w:pStyle w:val="INNH1"/>
-        <w:tabs>
-          <w:tab w:val="left" w:pos="720"/>
-        </w:tabs>
-        <w:rPr>
-          <w:rFonts w:asciiTheme="minorHAnsi" w:eastAsiaTheme="minorEastAsia" w:hAnsiTheme="minorHAnsi" w:cstheme="minorBidi"/>
-          <w:b w:val="0"/>
-          <w:kern w:val="2"/>
-          <w:lang w:val="en-GB" w:eastAsia="en-GB" w:bidi="ar-SA"/>
-          <w14:ligatures w14:val="standardContextual"/>
-        </w:rPr>
-      </w:pPr>
-      <w:hyperlink w:anchor="_Toc222057418" w:history="1">
-        <w:r>
-          <w:rPr>
-            <w:rStyle w:val="Hyperkobling"/>
-          </w:rPr>
-          <w:t>10.0</w:t>
-        </w:r>
-        <w:r>
-          <w:rPr>
-            <w:rFonts w:asciiTheme="minorHAnsi" w:eastAsiaTheme="minorEastAsia" w:hAnsiTheme="minorHAnsi" w:cstheme="minorBidi"/>
-            <w:b w:val="0"/>
-            <w:kern w:val="2"/>
-            <w:lang w:val="en-GB" w:eastAsia="en-GB" w:bidi="ar-SA"/>
-            <w14:ligatures w14:val="standardContextual"/>
-          </w:rPr>
-          <w:tab/>
-        </w:r>
-        <w:r>
-          <w:rPr>
-            <w:rStyle w:val="Hyperkobling"/>
-          </w:rPr>
-          <w:t>Konklusjon</w:t>
-        </w:r>
-        <w:r>
-          <w:rPr>
-            <w:webHidden/>
-          </w:rPr>
-          <w:tab/>
-        </w:r>
-        <w:r>
-          <w:rPr>
-            <w:webHidden/>
-          </w:rPr>
-          <w:fldChar w:fldCharType="begin"/>
-        </w:r>
-        <w:r>
-          <w:rPr>
-            <w:webHidden/>
-          </w:rPr>
-          <w:instrText xml:space="preserve"> PAGEREF _Toc222057418 \h </w:instrText>
-        </w:r>
-        <w:r>
-          <w:rPr>
-            <w:webHidden/>
-          </w:rPr>
-        </w:r>
-        <w:r>
-          <w:rPr>
-            <w:webHidden/>
-          </w:rPr>
-          <w:fldChar w:fldCharType="separate"/>
-        </w:r>
-        <w:r>
-          <w:rPr>
-            <w:webHidden/>
-          </w:rPr>
-          <w:t>8</w:t>
-        </w:r>
-        <w:r>
-          <w:rPr>
-            <w:webHidden/>
-          </w:rPr>
-          <w:fldChar w:fldCharType="end"/>
-        </w:r>
-      </w:hyperlink>
-    </w:p>
-    <w:p>
-      <w:pPr>
-        <w:pStyle w:val="INNH1"/>
-        <w:tabs>
-          <w:tab w:val="left" w:pos="720"/>
-        </w:tabs>
-        <w:rPr>
-          <w:rFonts w:asciiTheme="minorHAnsi" w:eastAsiaTheme="minorEastAsia" w:hAnsiTheme="minorHAnsi" w:cstheme="minorBidi"/>
-          <w:b w:val="0"/>
-          <w:kern w:val="2"/>
-          <w:lang w:val="en-GB" w:eastAsia="en-GB" w:bidi="ar-SA"/>
-          <w14:ligatures w14:val="standardContextual"/>
-        </w:rPr>
-      </w:pPr>
-      <w:hyperlink w:anchor="_Toc222057419" w:history="1">
-        <w:r>
-          <w:rPr>
-            <w:rStyle w:val="Hyperkobling"/>
-          </w:rPr>
-          <w:t>11.0</w:t>
-        </w:r>
-        <w:r>
-          <w:rPr>
-            <w:rFonts w:asciiTheme="minorHAnsi" w:eastAsiaTheme="minorEastAsia" w:hAnsiTheme="minorHAnsi" w:cstheme="minorBidi"/>
-            <w:b w:val="0"/>
-            <w:kern w:val="2"/>
-            <w:lang w:val="en-GB" w:eastAsia="en-GB" w:bidi="ar-SA"/>
-            <w14:ligatures w14:val="standardContextual"/>
-          </w:rPr>
-          <w:tab/>
-        </w:r>
-        <w:r>
-          <w:rPr>
-            <w:rStyle w:val="Hyperkobling"/>
-          </w:rPr>
-          <w:t>Bibliografi</w:t>
-        </w:r>
-        <w:r>
-          <w:rPr>
-            <w:webHidden/>
-          </w:rPr>
-          <w:tab/>
-        </w:r>
-        <w:r>
-          <w:rPr>
-            <w:webHidden/>
-          </w:rPr>
-          <w:fldChar w:fldCharType="begin"/>
-        </w:r>
-        <w:r>
-          <w:rPr>
-            <w:webHidden/>
-          </w:rPr>
-          <w:instrText xml:space="preserve"> PAGEREF _Toc222057419 \h </w:instrText>
-        </w:r>
-        <w:r>
-          <w:rPr>
-            <w:webHidden/>
-          </w:rPr>
-        </w:r>
-        <w:r>
-          <w:rPr>
-            <w:webHidden/>
-          </w:rPr>
-          <w:fldChar w:fldCharType="separate"/>
-        </w:r>
-        <w:r>
-          <w:rPr>
-            <w:webHidden/>
-          </w:rPr>
-          <w:t>8</w:t>
-        </w:r>
-        <w:r>
-          <w:rPr>
-            <w:webHidden/>
-          </w:rPr>
-          <w:fldChar w:fldCharType="end"/>
-        </w:r>
-      </w:hyperlink>
-    </w:p>
-    <w:p>
-      <w:pPr>
-        <w:pStyle w:val="INNH1"/>
-        <w:tabs>
-          <w:tab w:val="left" w:pos="720"/>
-        </w:tabs>
-        <w:rPr>
-          <w:rFonts w:asciiTheme="minorHAnsi" w:eastAsiaTheme="minorEastAsia" w:hAnsiTheme="minorHAnsi" w:cstheme="minorBidi"/>
-          <w:b w:val="0"/>
-          <w:kern w:val="2"/>
-          <w:lang w:val="en-GB" w:eastAsia="en-GB" w:bidi="ar-SA"/>
-          <w14:ligatures w14:val="standardContextual"/>
-        </w:rPr>
-      </w:pPr>
-      <w:hyperlink w:anchor="_Toc222057420" w:history="1">
-        <w:r>
-          <w:rPr>
-            <w:rStyle w:val="Hyperkobling"/>
-          </w:rPr>
-          <w:t>12.0</w:t>
-        </w:r>
-        <w:r>
-          <w:rPr>
-            <w:rFonts w:asciiTheme="minorHAnsi" w:eastAsiaTheme="minorEastAsia" w:hAnsiTheme="minorHAnsi" w:cstheme="minorBidi"/>
-            <w:b w:val="0"/>
-            <w:kern w:val="2"/>
-            <w:lang w:val="en-GB" w:eastAsia="en-GB" w:bidi="ar-SA"/>
-            <w14:ligatures w14:val="standardContextual"/>
-          </w:rPr>
-          <w:tab/>
-        </w:r>
-        <w:r>
-          <w:rPr>
-            <w:rStyle w:val="Hyperkobling"/>
-          </w:rPr>
-          <w:t>Vedlegg</w:t>
-        </w:r>
-        <w:r>
-          <w:rPr>
-            <w:webHidden/>
-          </w:rPr>
-          <w:tab/>
-        </w:r>
-        <w:r>
-          <w:rPr>
-            <w:webHidden/>
-          </w:rPr>
-          <w:fldChar w:fldCharType="begin"/>
-        </w:r>
-        <w:r>
-          <w:rPr>
-            <w:webHidden/>
-          </w:rPr>
-          <w:instrText xml:space="preserve"> PAGEREF _Toc222057420 \h </w:instrText>
-        </w:r>
-        <w:r>
-          <w:rPr>
-            <w:webHidden/>
-          </w:rPr>
-        </w:r>
-        <w:r>
-          <w:rPr>
-            <w:webHidden/>
-          </w:rPr>
-          <w:fldChar w:fldCharType="separate"/>
-        </w:r>
-        <w:r>
-          <w:rPr>
-            <w:webHidden/>
-          </w:rPr>
-          <w:t>8</w:t>
-        </w:r>
-        <w:r>
-          <w:rPr>
-            <w:webHidden/>
-          </w:rPr>
-          <w:fldChar w:fldCharType="end"/>
-        </w:r>
-      </w:hyperlink>
-    </w:p>
-    <w:p>
-      <w:pPr>
-        <w:sectPr>
-          <w:pgSz w:w="11907" w:h="16840"/>
-          <w:pgMar w:top="1411" w:right="1411" w:bottom="1411" w:left="1728" w:header="720" w:footer="403" w:gutter="0"/>
-          <w:cols w:space="720"/>
-          <w:formProt w:val="0"/>
-          <w:titlePg/>
-        </w:sectPr>
-      </w:pPr>
-      <w:r>
-        <w:rPr>
-          <w:rFonts w:ascii="Arial" w:hAnsi="Arial" w:cs="Arial"/>
-          <w:b/>
-          <w:noProof/>
-          <w:sz w:val="28"/>
-          <w:szCs w:val="28"/>
-        </w:rPr>
-        <w:fldChar w:fldCharType="end"/>
-      </w:r>
-    </w:p>
-    <w:p>
-      <w:pPr>
-        <w:pStyle w:val="Overskrift1"/>
-        <w:rPr>
-          <w:szCs w:val="36"/>
-        </w:rPr>
-      </w:pPr>
-      <w:bookmarkStart w:id="16" w:name="_Toc222057403"/>
-      <w:r>
-        <w:rPr>
-          <w:szCs w:val="36"/>
-        </w:rPr>
-        <w:lastRenderedPageBreak/>
-        <w:t>Innledning</w:t>
-      </w:r>
-      <w:bookmarkEnd w:id="16"/>
-    </w:p>
-    <w:p>
-      <w:r>
-        <w:t>Introduksjonen bør ikke være for lang, mellom 1-4 sider, helst</w:t>
-      </w:r>
-      <w:r>
-        <w:t xml:space="preserve"> kun</w:t>
-      </w:r>
-      <w:r>
-        <w:t xml:space="preserve"> 1-2.</w:t>
-      </w:r>
-      <w:r>
-        <w:t xml:space="preserve"> For mye skrift her kan være et tegn på at man sliter med å være presis.</w:t>
-      </w:r>
-      <w:r>
-        <w:t xml:space="preserve"> Ta utgangspunkt i et generelt tema og deretter beskriv den aktuelle problemstillingen.</w:t>
-      </w:r>
-    </w:p>
-    <w:p/>
-    <w:p>
-      <w:r>
-        <w:t>Svar på følgende spørsmål:</w:t>
-      </w:r>
-    </w:p>
-    <w:p>
-      <w:pPr>
-        <w:pStyle w:val="Listeavsnitt"/>
-        <w:numPr>
-          <w:ilvl w:val="0"/>
-          <w:numId w:val="25"/>
-        </w:numPr>
-      </w:pPr>
-      <w:r>
-        <w:t>Hv</w:t>
-      </w:r>
-      <w:r>
-        <w:t>ilket tema</w:t>
-      </w:r>
-      <w:r>
-        <w:t xml:space="preserve"> handler oppgaven om?</w:t>
-      </w:r>
-    </w:p>
-    <w:p>
-      <w:pPr>
-        <w:pStyle w:val="Listeavsnitt"/>
-        <w:numPr>
-          <w:ilvl w:val="0"/>
-          <w:numId w:val="25"/>
-        </w:numPr>
-      </w:pPr>
-      <w:r>
-        <w:t>Hvorfor er tema aktuelt?</w:t>
-      </w:r>
-    </w:p>
-    <w:p>
-      <w:pPr>
-        <w:pStyle w:val="Listeavsnitt"/>
-        <w:numPr>
-          <w:ilvl w:val="0"/>
-          <w:numId w:val="25"/>
-        </w:numPr>
-      </w:pPr>
-      <w:r>
-        <w:t>Hva har blitt gjort tidligere</w:t>
-      </w:r>
-      <w:r>
-        <w:t xml:space="preserve"> </w:t>
-      </w:r>
-      <w:r>
-        <w:t>(</w:t>
-      </w:r>
-      <w:r>
-        <w:t>de mest vesentlige referansene</w:t>
-      </w:r>
-      <w:r>
-        <w:t>)</w:t>
-      </w:r>
-      <w:r>
-        <w:t>?</w:t>
-      </w:r>
-    </w:p>
-    <w:p>
-      <w:pPr>
-        <w:pStyle w:val="Listeavsnitt"/>
-        <w:numPr>
-          <w:ilvl w:val="0"/>
-          <w:numId w:val="25"/>
-        </w:numPr>
-      </w:pPr>
-      <w:r>
-        <w:t xml:space="preserve">Hva </w:t>
-      </w:r>
-      <w:r>
-        <w:t xml:space="preserve">er rapportens problemstilling (eget </w:t>
-      </w:r>
-      <w:r>
-        <w:t>underavsnitt</w:t>
-      </w:r>
-      <w:r>
-        <w:t>)</w:t>
-      </w:r>
-      <w:r>
-        <w:t>?</w:t>
-      </w:r>
-    </w:p>
-    <w:p>
-      <w:pPr>
-        <w:pStyle w:val="Listeavsnitt"/>
-        <w:numPr>
-          <w:ilvl w:val="0"/>
-          <w:numId w:val="25"/>
-        </w:numPr>
-      </w:pPr>
-      <w:r>
-        <w:t xml:space="preserve">Hvilke avgrensinger </w:t>
-      </w:r>
-      <w:r>
-        <w:t>gjøres</w:t>
-      </w:r>
-      <w:r>
-        <w:t xml:space="preserve"> (eget underavsnitt)?</w:t>
-      </w:r>
-    </w:p>
-    <w:p/>
-    <w:p>
-      <w:r>
-        <w:t>Viktige momenter:</w:t>
-      </w:r>
-    </w:p>
-    <w:p>
-      <w:pPr>
-        <w:pStyle w:val="Listeavsnitt"/>
-        <w:numPr>
-          <w:ilvl w:val="0"/>
-          <w:numId w:val="26"/>
-        </w:numPr>
-      </w:pPr>
-      <w:r>
-        <w:t xml:space="preserve">Skap </w:t>
-      </w:r>
-      <w:r>
-        <w:t>nysgjerrighet</w:t>
-      </w:r>
-      <w:r>
-        <w:t xml:space="preserve"> slik at leseren </w:t>
-      </w:r>
-      <w:r>
-        <w:t>ønsker å lese videre</w:t>
-      </w:r>
-      <w:r>
-        <w:t>. Kunsten er ofte å aktualisere temaet</w:t>
-      </w:r>
-      <w:r>
-        <w:t xml:space="preserve"> for deretter </w:t>
-      </w:r>
-      <w:proofErr w:type="spellStart"/>
-      <w:r>
-        <w:t>o</w:t>
-      </w:r>
-      <w:proofErr w:type="spellEnd"/>
-      <w:r>
-        <w:t xml:space="preserve"> peke på konsekvenser som resultatet kan gi. Men unngå å brodere ut hvordan </w:t>
-      </w:r>
-      <w:r>
-        <w:t>resultatet oppnås</w:t>
-      </w:r>
-      <w:r>
-        <w:t xml:space="preserve"> – for </w:t>
-      </w:r>
-      <w:r>
-        <w:t>da</w:t>
-      </w:r>
-      <w:r>
-        <w:t xml:space="preserve"> må leseren </w:t>
-      </w:r>
-      <w:r>
-        <w:t>lese</w:t>
-      </w:r>
-      <w:r>
-        <w:t xml:space="preserve"> videre.</w:t>
-      </w:r>
-      <w:r>
-        <w:t xml:space="preserve"> </w:t>
-      </w:r>
-    </w:p>
-    <w:p>
-      <w:pPr>
-        <w:pStyle w:val="Listeavsnitt"/>
-        <w:numPr>
-          <w:ilvl w:val="0"/>
-          <w:numId w:val="26"/>
-        </w:numPr>
-      </w:pPr>
-      <w:r>
-        <w:t xml:space="preserve">Prøv å </w:t>
-      </w:r>
-      <w:r>
-        <w:t>gi leseren innblikk i strukturen</w:t>
-      </w:r>
-      <w:r>
-        <w:t xml:space="preserve"> til rapporten gjennom </w:t>
-      </w:r>
-      <w:r>
-        <w:t>hele introduksjonen</w:t>
-      </w:r>
-      <w:r>
-        <w:t>.</w:t>
-      </w:r>
-    </w:p>
-    <w:p>
-      <w:pPr>
-        <w:pStyle w:val="Listeavsnitt"/>
-        <w:numPr>
-          <w:ilvl w:val="1"/>
-          <w:numId w:val="26"/>
-        </w:numPr>
-      </w:pPr>
-      <w:r>
-        <w:t>«</w:t>
-      </w:r>
-      <w:r>
-        <w:t>Lakseprisens vola</w:t>
-      </w:r>
-      <w:r>
-        <w:t>ti</w:t>
-      </w:r>
-      <w:r>
-        <w:t xml:space="preserve">litet </w:t>
-      </w:r>
-      <w:r>
-        <w:t xml:space="preserve">påvirker svært mange aktører </w:t>
-      </w:r>
-      <w:proofErr w:type="gramStart"/>
-      <w:r>
-        <w:t>som…</w:t>
-      </w:r>
-      <w:proofErr w:type="gramEnd"/>
-      <w:r>
-        <w:t>»</w:t>
-      </w:r>
-    </w:p>
-    <w:p>
-      <w:pPr>
-        <w:pStyle w:val="Listeavsnitt"/>
-        <w:numPr>
-          <w:ilvl w:val="1"/>
-          <w:numId w:val="26"/>
-        </w:numPr>
-      </w:pPr>
-      <w:r>
-        <w:t>«</w:t>
-      </w:r>
-      <w:proofErr w:type="spellStart"/>
-      <w:r>
-        <w:t>Ref</w:t>
-      </w:r>
-      <w:proofErr w:type="spellEnd"/>
-      <w:r>
-        <w:t xml:space="preserve"> 1 har vist at lakseprisen er avhengig </w:t>
-      </w:r>
-      <w:proofErr w:type="gramStart"/>
-      <w:r>
-        <w:t>av…</w:t>
-      </w:r>
-      <w:proofErr w:type="gramEnd"/>
-      <w:r>
-        <w:t>»</w:t>
-      </w:r>
-    </w:p>
-    <w:p>
-      <w:pPr>
-        <w:pStyle w:val="Listeavsnitt"/>
-        <w:numPr>
-          <w:ilvl w:val="1"/>
-          <w:numId w:val="26"/>
-        </w:numPr>
-      </w:pPr>
-      <w:r>
-        <w:t xml:space="preserve">«Derimot argumenter </w:t>
-      </w:r>
-      <w:proofErr w:type="spellStart"/>
-      <w:r>
-        <w:t>Ref</w:t>
-      </w:r>
-      <w:proofErr w:type="spellEnd"/>
-      <w:r>
-        <w:t xml:space="preserve"> 2 at </w:t>
-      </w:r>
-      <w:r>
-        <w:t>volatiliteten også påvirkes av»</w:t>
-      </w:r>
-    </w:p>
-    <w:p>
-      <w:pPr>
-        <w:pStyle w:val="Listeavsnitt"/>
-        <w:numPr>
-          <w:ilvl w:val="1"/>
-          <w:numId w:val="26"/>
-        </w:numPr>
-      </w:pPr>
-      <w:r>
-        <w:t>«</w:t>
-      </w:r>
-      <w:r>
-        <w:t>L</w:t>
-      </w:r>
-      <w:r>
-        <w:t>itteraturstudiet vårt viser at</w:t>
-      </w:r>
-      <w:r>
-        <w:t xml:space="preserve"> ingen </w:t>
-      </w:r>
-      <w:r>
-        <w:t xml:space="preserve">har </w:t>
-      </w:r>
-      <w:r>
-        <w:t>inkludert</w:t>
-      </w:r>
-      <w:r>
-        <w:t xml:space="preserve"> </w:t>
-      </w:r>
-      <w:r>
-        <w:t>faktorer som</w:t>
-      </w:r>
-      <w:r>
-        <w:t xml:space="preserve"> …»</w:t>
-      </w:r>
-    </w:p>
-    <w:p>
-      <w:pPr>
-        <w:pStyle w:val="Listeavsnitt"/>
-        <w:numPr>
-          <w:ilvl w:val="1"/>
-          <w:numId w:val="26"/>
-        </w:numPr>
-      </w:pPr>
-      <w:r>
-        <w:t>«</w:t>
-      </w:r>
-      <w:r>
-        <w:t xml:space="preserve">For </w:t>
-      </w:r>
-      <w:proofErr w:type="spellStart"/>
-      <w:r>
-        <w:t>Maritech</w:t>
-      </w:r>
-      <w:proofErr w:type="spellEnd"/>
-      <w:r>
-        <w:t xml:space="preserve"> skaper volatiliteten </w:t>
-      </w:r>
-      <w:r>
-        <w:t xml:space="preserve">utfordringer for kundene </w:t>
-      </w:r>
-      <w:proofErr w:type="gramStart"/>
-      <w:r>
-        <w:t>fordi…</w:t>
-      </w:r>
-      <w:proofErr w:type="gramEnd"/>
-      <w:r>
-        <w:t>»</w:t>
-      </w:r>
-    </w:p>
-    <w:p>
-      <w:pPr>
-        <w:pStyle w:val="Listeavsnitt"/>
-        <w:numPr>
-          <w:ilvl w:val="1"/>
-          <w:numId w:val="26"/>
-        </w:numPr>
-      </w:pPr>
-      <w:r>
-        <w:t>«Med bedre</w:t>
-      </w:r>
-      <w:r>
-        <w:t xml:space="preserve"> modeller kan </w:t>
-      </w:r>
-      <w:proofErr w:type="spellStart"/>
-      <w:r>
-        <w:t>Maritech</w:t>
-      </w:r>
-      <w:proofErr w:type="spellEnd"/>
-      <w:r>
-        <w:t xml:space="preserve"> gi fordel til sine kunder</w:t>
-      </w:r>
-      <w:r>
-        <w:t xml:space="preserve"> ved </w:t>
-      </w:r>
-      <w:proofErr w:type="gramStart"/>
-      <w:r>
-        <w:t>at</w:t>
-      </w:r>
-      <w:r>
-        <w:t>…</w:t>
-      </w:r>
-      <w:proofErr w:type="gramEnd"/>
-      <w:r>
-        <w:t>»</w:t>
-      </w:r>
-      <w:r>
-        <w:t xml:space="preserve"> </w:t>
-      </w:r>
-    </w:p>
-    <w:p>
-      <w:pPr>
-        <w:pStyle w:val="Listeavsnitt"/>
-        <w:numPr>
-          <w:ilvl w:val="1"/>
-          <w:numId w:val="26"/>
-        </w:numPr>
-      </w:pPr>
-      <w:r>
-        <w:t>«</w:t>
-      </w:r>
-      <w:r>
-        <w:t xml:space="preserve">Vi </w:t>
-      </w:r>
-      <w:r>
-        <w:t>har brukt</w:t>
-      </w:r>
-      <w:r>
-        <w:t xml:space="preserve"> </w:t>
-      </w:r>
-      <w:r>
-        <w:t>bedriftens salgsdata for å kartlegge</w:t>
-      </w:r>
-      <w:r>
-        <w:t xml:space="preserve"> </w:t>
-      </w:r>
-      <w:r>
-        <w:t xml:space="preserve">hvilke faktorer </w:t>
-      </w:r>
-      <w:proofErr w:type="gramStart"/>
-      <w:r>
-        <w:t>som</w:t>
-      </w:r>
-      <w:r>
-        <w:t>…</w:t>
-      </w:r>
-      <w:proofErr w:type="gramEnd"/>
-      <w:r>
-        <w:t>»</w:t>
-      </w:r>
-    </w:p>
-    <w:p>
-      <w:pPr>
-        <w:pStyle w:val="Listeavsnitt"/>
-        <w:numPr>
-          <w:ilvl w:val="1"/>
-          <w:numId w:val="26"/>
-        </w:numPr>
-      </w:pPr>
-      <w:r>
-        <w:t>«Basert på</w:t>
-      </w:r>
-      <w:r>
-        <w:t xml:space="preserve"> statistisk</w:t>
-      </w:r>
-      <w:r>
-        <w:t xml:space="preserve"> </w:t>
-      </w:r>
-      <w:r>
-        <w:t>regresjonste</w:t>
-      </w:r>
-      <w:r>
-        <w:t>ori</w:t>
-      </w:r>
-      <w:r>
-        <w:t xml:space="preserve"> </w:t>
-      </w:r>
-      <w:r>
-        <w:t xml:space="preserve">har vi </w:t>
-      </w:r>
-      <w:r>
-        <w:t>beskrev</w:t>
-      </w:r>
-      <w:r>
-        <w:t>et</w:t>
-      </w:r>
-      <w:r>
-        <w:t xml:space="preserve"> en</w:t>
-      </w:r>
-      <w:r>
-        <w:t xml:space="preserve"> ny</w:t>
-      </w:r>
-      <w:r>
-        <w:t xml:space="preserve"> modell </w:t>
-      </w:r>
-      <w:proofErr w:type="gramStart"/>
-      <w:r>
-        <w:t>som…</w:t>
-      </w:r>
-      <w:proofErr w:type="gramEnd"/>
-      <w:r>
-        <w:t>»</w:t>
-      </w:r>
-    </w:p>
-    <w:p>
-      <w:pPr>
-        <w:pStyle w:val="Listeavsnitt"/>
-        <w:numPr>
-          <w:ilvl w:val="1"/>
-          <w:numId w:val="26"/>
-        </w:numPr>
-      </w:pPr>
-      <w:r>
-        <w:t>«</w:t>
-      </w:r>
-      <w:r>
-        <w:t>I a</w:t>
-      </w:r>
-      <w:r>
-        <w:t xml:space="preserve">nalysen </w:t>
-      </w:r>
-      <w:r>
-        <w:t xml:space="preserve">har vi indentifisert interessante funn som </w:t>
-      </w:r>
-      <w:proofErr w:type="spellStart"/>
-      <w:r>
-        <w:t>bl.a</w:t>
-      </w:r>
-      <w:proofErr w:type="spellEnd"/>
-      <w:r>
-        <w:t>…»</w:t>
-      </w:r>
-    </w:p>
-    <w:p>
-      <w:pPr>
-        <w:pStyle w:val="Listeavsnitt"/>
-        <w:numPr>
-          <w:ilvl w:val="1"/>
-          <w:numId w:val="26"/>
-        </w:numPr>
-      </w:pPr>
-      <w:r>
-        <w:t xml:space="preserve">«Konklusjonen er derfor </w:t>
-      </w:r>
-      <w:proofErr w:type="gramStart"/>
-      <w:r>
-        <w:t>at</w:t>
-      </w:r>
-      <w:r>
-        <w:t>…</w:t>
-      </w:r>
-      <w:proofErr w:type="gramEnd"/>
-      <w:r>
-        <w:t>»</w:t>
-      </w:r>
-    </w:p>
-    <w:p>
-      <w:pPr>
-        <w:pStyle w:val="Listeavsnitt"/>
-        <w:numPr>
-          <w:ilvl w:val="0"/>
-          <w:numId w:val="26"/>
-        </w:numPr>
-      </w:pPr>
-      <w:r>
-        <w:t>Det er lurt å</w:t>
-      </w:r>
-      <w:r>
-        <w:t xml:space="preserve"> henvise tilbake til introduksjonen</w:t>
-      </w:r>
-      <w:r>
-        <w:t xml:space="preserve"> </w:t>
-      </w:r>
-      <w:r>
-        <w:rPr>
-          <w:i/>
-          <w:iCs/>
-        </w:rPr>
-        <w:t>indirekte</w:t>
-      </w:r>
-      <w:r>
-        <w:t xml:space="preserve"> ved å f.eks. bruke setninger som </w:t>
-      </w:r>
-      <w:r>
-        <w:t xml:space="preserve">gjentar litt det som ble sagt i introduksjonen. På den måten skapes det en </w:t>
-      </w:r>
-      <w:r>
-        <w:t>rød tr</w:t>
-      </w:r>
-      <w:r>
-        <w:t>å</w:t>
-      </w:r>
-      <w:r>
-        <w:t>d</w:t>
-      </w:r>
-      <w:r>
-        <w:t xml:space="preserve"> hos leseren </w:t>
-      </w:r>
-      <w:r>
-        <w:t xml:space="preserve">gjennom hele rapporten </w:t>
-      </w:r>
-      <w:r>
-        <w:t xml:space="preserve">hvor hen minnes på hvorfor </w:t>
-      </w:r>
-      <w:r>
-        <w:t>rapporten er interessant</w:t>
-      </w:r>
-      <w:r>
-        <w:t>.</w:t>
-      </w:r>
-    </w:p>
-    <w:p>
-      <w:pPr>
-        <w:pStyle w:val="Overskrift2"/>
-      </w:pPr>
-      <w:bookmarkStart w:id="17" w:name="_Toc222057404"/>
-      <w:r>
-        <w:lastRenderedPageBreak/>
-        <w:t>Problemstilling</w:t>
-      </w:r>
-      <w:bookmarkEnd w:id="17"/>
-    </w:p>
-    <w:p>
-      <w:r>
-        <w:t>Problemstillingen din er avgjørende for et godt resultat. Dette skal ikke være et «hva»- eller «hvilket»-spørsmål.</w:t>
-      </w:r>
-    </w:p>
-    <w:p>
-      <w:pPr>
-        <w:rPr>
-          <w:lang w:eastAsia="nb-NO" w:bidi="ar-SA"/>
-        </w:rPr>
-      </w:pPr>
-    </w:p>
-    <w:p>
-      <w:r>
-        <w:t>Sørg for at du har en «hvordan»- eller «hvorfor»-spørsmål, noe som vil gjøre problemstillingen din mye mer omfattende.</w:t>
-      </w:r>
-    </w:p>
-    <w:p/>
-    <w:p>
-      <w:r>
-        <w:t>En god problemstilling danner grunnlaget for hele oppgaven din, så her er det verdt å tenke seg nøye om.</w:t>
-      </w:r>
-    </w:p>
-    <w:p/>
-    <w:p>
-      <w:r>
-        <w:t xml:space="preserve">Kan godt gjenta noe av det som ble sagt i innledningen. </w:t>
-      </w:r>
-    </w:p>
-    <w:p/>
-    <w:p>
-      <w:r>
-        <w:t>Her er det viktig at du</w:t>
-      </w:r>
-    </w:p>
-    <w:p>
-      <w:pPr>
-        <w:pStyle w:val="Listeavsnitt"/>
-        <w:numPr>
-          <w:ilvl w:val="0"/>
-          <w:numId w:val="27"/>
-        </w:numPr>
-      </w:pPr>
-      <w:r>
-        <w:t>er så spesifikk som mulig</w:t>
-      </w:r>
-    </w:p>
-    <w:p>
-      <w:pPr>
-        <w:pStyle w:val="Listeavsnitt"/>
-        <w:numPr>
-          <w:ilvl w:val="0"/>
-          <w:numId w:val="27"/>
-        </w:numPr>
-      </w:pPr>
-      <w:r>
-        <w:t>er svært nøye med formuleringene</w:t>
-      </w:r>
-    </w:p>
-    <w:p>
-      <w:pPr>
-        <w:pStyle w:val="Listeavsnitt"/>
-        <w:numPr>
-          <w:ilvl w:val="0"/>
-          <w:numId w:val="27"/>
-        </w:numPr>
-      </w:pPr>
-      <w:r>
-        <w:t>ikke skriver noe du ikke svarer på (</w:t>
-      </w:r>
-      <w:proofErr w:type="spellStart"/>
-      <w:r>
-        <w:rPr>
-          <w:color w:val="FF0000"/>
-        </w:rPr>
-        <w:t>dangerzone</w:t>
-      </w:r>
-      <w:proofErr w:type="spellEnd"/>
-      <w:r>
-        <w:t>)</w:t>
-      </w:r>
-    </w:p>
-    <w:p>
-      <w:pPr>
-        <w:pStyle w:val="Listeavsnitt"/>
-        <w:numPr>
-          <w:ilvl w:val="0"/>
-          <w:numId w:val="27"/>
-        </w:numPr>
-      </w:pPr>
-      <w:r>
-        <w:t xml:space="preserve">ikke svarer på noe </w:t>
-      </w:r>
-      <w:r>
-        <w:rPr>
-          <w:i/>
-          <w:iCs/>
-        </w:rPr>
-        <w:t>mer</w:t>
-      </w:r>
-      <w:r>
-        <w:t xml:space="preserve"> enn det som står i problemstillingen (da burde det enten vært tatt ut eller vært inkludert i problemstillingen (</w:t>
-      </w:r>
-      <w:proofErr w:type="spellStart"/>
-      <w:r>
-        <w:rPr>
-          <w:color w:val="FF0000"/>
-        </w:rPr>
-        <w:t>dangerzone</w:t>
-      </w:r>
-      <w:proofErr w:type="spellEnd"/>
-      <w:r>
-        <w:t xml:space="preserve">) </w:t>
-      </w:r>
-    </w:p>
-    <w:p>
-      <w:pPr>
-        <w:pStyle w:val="Overskrift2"/>
-      </w:pPr>
-      <w:bookmarkStart w:id="18" w:name="_Toc222057405"/>
-      <w:r>
-        <w:t>Delproblemer (valgfri)</w:t>
-      </w:r>
-      <w:bookmarkEnd w:id="18"/>
-    </w:p>
-    <w:p>
-      <w:r>
-        <w:t>Du kan om nødvendig dele opp problemstillingen din i flere delproblemer, dersom problemstillingen er komplisert eller omfattende. Det er da viktig at disse delproblemene blir fremstilt i en logisk rekkefølge som gir mening for hovedproblemstillingen. Vær også tydelig til leseren hvilket delproblem du svarer på til enhver tid.</w:t>
-      </w:r>
-    </w:p>
-    <w:p>
-      <w:pPr>
-        <w:pStyle w:val="Overskrift2"/>
-      </w:pPr>
-      <w:bookmarkStart w:id="19" w:name="_Toc222057406"/>
-      <w:r>
-        <w:t>Avgrensinger</w:t>
-      </w:r>
-      <w:bookmarkEnd w:id="19"/>
-    </w:p>
-    <w:p>
-      <w:r>
-        <w:t xml:space="preserve">Avgrensing er en svært viktig måte å </w:t>
-      </w:r>
-      <w:r>
-        <w:rPr>
-          <w:i/>
-          <w:iCs/>
-        </w:rPr>
-        <w:t>snevre inn</w:t>
-      </w:r>
-      <w:r>
-        <w:t xml:space="preserve"> en problemstilling. Her forklarer du hvorfor du ikke har tatt med det og det. Pass på at du ikke avgrenser noe uten å forklare hvorfor, og husk aldri skriv at du ikke har nok tid e.l. det er et stort tegn på en for vidt formulert problemstilling.</w:t>
-      </w:r>
-    </w:p>
-    <w:p>
-      <w:pPr>
-        <w:pStyle w:val="Listeavsnitt"/>
-        <w:numPr>
-          <w:ilvl w:val="0"/>
-          <w:numId w:val="28"/>
-        </w:numPr>
-      </w:pPr>
-      <w:r>
-        <w:t xml:space="preserve">«Vi avgrenser oppgaven til kun ett produkt </w:t>
-      </w:r>
-      <w:proofErr w:type="gramStart"/>
-      <w:r>
-        <w:t>siden…</w:t>
-      </w:r>
-      <w:proofErr w:type="gramEnd"/>
-      <w:r>
-        <w:t>»</w:t>
-      </w:r>
-    </w:p>
-    <w:p>
-      <w:pPr>
-        <w:pStyle w:val="Listeavsnitt"/>
-        <w:numPr>
-          <w:ilvl w:val="0"/>
-          <w:numId w:val="28"/>
-        </w:numPr>
-      </w:pPr>
-      <w:r>
-        <w:t xml:space="preserve">«Vi analyserer 80% av kundene da de resterende </w:t>
-      </w:r>
-      <w:proofErr w:type="gramStart"/>
-      <w:r>
-        <w:t>ikke…</w:t>
-      </w:r>
-      <w:proofErr w:type="gramEnd"/>
-      <w:r>
-        <w:t>»</w:t>
-      </w:r>
-    </w:p>
-    <w:p>
-      <w:pPr>
-        <w:pStyle w:val="Listeavsnitt"/>
-        <w:numPr>
-          <w:ilvl w:val="0"/>
-          <w:numId w:val="28"/>
-        </w:numPr>
-      </w:pPr>
-      <w:r>
-        <w:t xml:space="preserve">«Oppgaven omfatter kun Norge, da det utenlandske markedet </w:t>
-      </w:r>
-      <w:proofErr w:type="gramStart"/>
-      <w:r>
-        <w:t>ikke…</w:t>
-      </w:r>
-      <w:proofErr w:type="gramEnd"/>
-      <w:r>
-        <w:t>»</w:t>
-      </w:r>
-    </w:p>
-    <w:p>
-      <w:pPr>
-        <w:pStyle w:val="Overskrift2"/>
-      </w:pPr>
-      <w:bookmarkStart w:id="20" w:name="_Toc222057407"/>
-      <w:r>
-        <w:lastRenderedPageBreak/>
-        <w:t>Antagelser</w:t>
-      </w:r>
-      <w:bookmarkEnd w:id="20"/>
-    </w:p>
-    <w:p>
-      <w:r>
-        <w:t xml:space="preserve">Antagelser er en måte å </w:t>
-      </w:r>
-      <w:r>
-        <w:rPr>
-          <w:i/>
-          <w:iCs/>
-        </w:rPr>
-        <w:t>presisere</w:t>
-      </w:r>
-      <w:r>
-        <w:t xml:space="preserve"> en problemstilling på. En antagelser er ikke det samme som avgrensing. En avgrensing snevrer inn omfanget, mens en antagelse presiserer situasjonen som analyseres. Man må forklare hvorfor man har tatt antagelsen, og hvilke konsekvenser den får på aktualiteten til analysen.</w:t>
-      </w:r>
-    </w:p>
-    <w:p>
-      <w:pPr>
-        <w:pStyle w:val="Listeavsnitt"/>
-        <w:numPr>
-          <w:ilvl w:val="0"/>
-          <w:numId w:val="29"/>
-        </w:numPr>
-      </w:pPr>
-      <w:r>
-        <w:t xml:space="preserve">«Vi antar at antall innkommende ordrer er Poissonfordelt </w:t>
-      </w:r>
-      <w:proofErr w:type="gramStart"/>
-      <w:r>
-        <w:t>fordi…dette</w:t>
-      </w:r>
-      <w:proofErr w:type="gramEnd"/>
-      <w:r>
-        <w:t xml:space="preserve"> gjør </w:t>
-      </w:r>
-      <w:proofErr w:type="gramStart"/>
-      <w:r>
-        <w:t>at…</w:t>
-      </w:r>
-      <w:proofErr w:type="gramEnd"/>
-      <w:r>
-        <w:t>»</w:t>
-      </w:r>
-    </w:p>
-    <w:p>
-      <w:pPr>
-        <w:pStyle w:val="Listeavsnitt"/>
-        <w:numPr>
-          <w:ilvl w:val="0"/>
-          <w:numId w:val="29"/>
-        </w:numPr>
-      </w:pPr>
-      <w:r>
-        <w:t xml:space="preserve">«Vi antar at vi kan se vekk fra effekten av prisene i Sverige </w:t>
-      </w:r>
-      <w:proofErr w:type="gramStart"/>
-      <w:r>
-        <w:t>fordi…dette</w:t>
-      </w:r>
-      <w:proofErr w:type="gramEnd"/>
-      <w:r>
-        <w:t xml:space="preserve"> gjør </w:t>
-      </w:r>
-      <w:proofErr w:type="gramStart"/>
-      <w:r>
-        <w:t>at…</w:t>
-      </w:r>
-      <w:proofErr w:type="gramEnd"/>
-      <w:r>
-        <w:t>»</w:t>
-      </w:r>
-    </w:p>
-    <w:p/>
-    <w:p>
-      <w:pPr>
-        <w:pStyle w:val="Overskrift1"/>
-      </w:pPr>
-      <w:bookmarkStart w:id="21" w:name="_Toc222057408"/>
-      <w:r>
-        <w:t>Litteratur</w:t>
-      </w:r>
-      <w:bookmarkEnd w:id="21"/>
-    </w:p>
-    <w:p>
-      <w:r>
-        <w:t xml:space="preserve">Diskuter de viktigste bidragene de 5 siste årene innen temaet du har valgt. Prøv å trekk tråder til din problemstilling og beskriv hvor og hvordan din rapport forholder seg til disse. Pass på at referanser blir korrekte. </w:t>
-      </w:r>
-    </w:p>
-    <w:p>
-      <w:pPr>
-        <w:pStyle w:val="Listeavsnitt"/>
-        <w:numPr>
-          <w:ilvl w:val="0"/>
-          <w:numId w:val="31"/>
-        </w:numPr>
-      </w:pPr>
-      <w:r>
-        <w:t xml:space="preserve">Det er ikke alltid nødvendig å ha et eget kapittel for litteratur, det viktigste av alt er at man aldri, </w:t>
-      </w:r>
-      <w:r>
-        <w:rPr>
-          <w:i/>
-          <w:iCs/>
-          <w:color w:val="FF0000"/>
-        </w:rPr>
-        <w:t>aldri</w:t>
-      </w:r>
-      <w:r>
-        <w:rPr>
-          <w:color w:val="FF0000"/>
-        </w:rPr>
-        <w:t xml:space="preserve"> </w:t>
-      </w:r>
-      <w:r>
-        <w:t>siterer noen eller kommer med fakta eller påstander, uten at det refereres til hvor du har denne påstanden ifra.  Dette kaller vi synsing, og synsing trekker ned karakteren kraftig.</w:t>
-      </w:r>
-    </w:p>
-    <w:p>
-      <w:pPr>
-        <w:pStyle w:val="Listeavsnitt"/>
-        <w:numPr>
-          <w:ilvl w:val="0"/>
-          <w:numId w:val="31"/>
-        </w:numPr>
-      </w:pPr>
-      <w:r>
-        <w:t>Det kan ofte skje at man henviser til samme rapport flere ganger i teksten. Unngå da å repetere funnene i rapporten, men ha med selve referansen.</w:t>
-      </w:r>
-    </w:p>
-    <w:p>
-      <w:pPr>
-        <w:pStyle w:val="Listeavsnitt"/>
-        <w:numPr>
-          <w:ilvl w:val="0"/>
-          <w:numId w:val="31"/>
-        </w:numPr>
-      </w:pPr>
-      <w:r>
-        <w:t>Husk en referanse har to hensikter:</w:t>
-      </w:r>
-    </w:p>
-    <w:p>
-      <w:pPr>
-        <w:pStyle w:val="Listeavsnitt"/>
-        <w:numPr>
-          <w:ilvl w:val="1"/>
-          <w:numId w:val="31"/>
-        </w:numPr>
-      </w:pPr>
-      <w:r>
-        <w:t>Kreditere resultatet til de som fant det.</w:t>
-      </w:r>
-    </w:p>
-    <w:p>
-      <w:pPr>
-        <w:pStyle w:val="Listeavsnitt"/>
-        <w:numPr>
-          <w:ilvl w:val="1"/>
-          <w:numId w:val="31"/>
-        </w:numPr>
-      </w:pPr>
-      <w:r>
-        <w:t>Gi leseren en mulighet til å sjekke opp en påstand eller fakta som du bygger rapporten din på.</w:t>
-      </w:r>
-    </w:p>
-    <w:p>
-      <w:pPr>
-        <w:pStyle w:val="Overskrift1"/>
-      </w:pPr>
-      <w:bookmarkStart w:id="22" w:name="_Toc222057409"/>
-      <w:r>
-        <w:t>Teori</w:t>
-      </w:r>
-      <w:bookmarkEnd w:id="22"/>
-    </w:p>
-    <w:p>
-      <w:r>
-        <w:t>Når du skal skrive en bacheloroppgave, er det også viktig å inkludere en teoridel. Her skal du beskrive teoretisk perspektiv, tidligere litteratur som beskriver samme tema og hva forskere eventuelt er uenige om.</w:t>
-      </w:r>
-    </w:p>
-    <w:p>
-      <w:pPr>
-        <w:rPr>
-          <w:lang w:eastAsia="nb-NO" w:bidi="ar-SA"/>
-        </w:rPr>
-      </w:pPr>
-    </w:p>
-    <w:p>
-      <w:r>
-        <w:t>Du kan også nevne hvorvidt tidligere forskning kan ha oversett noen faktorer, og plassere egen problemstilling i lys av tidligere litteratur på fagfeltet. </w:t>
-      </w:r>
-    </w:p>
-    <w:p>
-      <w:r>
-        <w:lastRenderedPageBreak/>
-        <w:t>Pass på at du får frem hva problemstillingen din belyser, som ikke tidligere forskning allerede har gjennomgått.</w:t>
-      </w:r>
-    </w:p>
-    <w:p/>
-    <w:p>
-      <w:r>
-        <w:t>Teoridelen din skal rett og slett beskrive grunnlaget for studiet ditt, og danner utgangspunktet for videre metodevalg.</w:t>
-      </w:r>
-    </w:p>
-    <w:p/>
-    <w:p>
-      <w:pPr>
-        <w:pStyle w:val="Overskrift1"/>
-      </w:pPr>
-      <w:bookmarkStart w:id="23" w:name="_Toc222057410"/>
-      <w:r>
-        <w:t>Casebeskrivelse</w:t>
-      </w:r>
-      <w:bookmarkEnd w:id="23"/>
-    </w:p>
-    <w:p>
-      <w:r>
-        <w:t>Har skal problemstilling</w:t>
-      </w:r>
-      <w:r>
-        <w:t>en</w:t>
-      </w:r>
-      <w:r>
-        <w:t xml:space="preserve"> </w:t>
-      </w:r>
-      <w:r>
-        <w:t>utbroderes for den bedriften du sama</w:t>
-      </w:r>
-      <w:r>
-        <w:t>rbeidet med</w:t>
-      </w:r>
-      <w:r>
-        <w:t xml:space="preserve"> eller </w:t>
-      </w:r>
-      <w:proofErr w:type="gramStart"/>
-      <w:r>
-        <w:t xml:space="preserve">det </w:t>
-      </w:r>
-      <w:r>
-        <w:t>.</w:t>
-      </w:r>
-      <w:proofErr w:type="gramEnd"/>
-      <w:r>
-        <w:t xml:space="preserve"> </w:t>
-      </w:r>
-      <w:r>
-        <w:t>Ta med all relevant informasjon som</w:t>
-      </w:r>
-      <w:r>
-        <w:t xml:space="preserve"> er nødvendig for å få en full forståelse av problemet, men ikke mer. </w:t>
-      </w:r>
-      <w:r>
-        <w:t xml:space="preserve"> </w:t>
-      </w:r>
-      <w:r>
-        <w:t>Husk å holde den røde tråden til problemstillingen, unø</w:t>
-      </w:r>
-      <w:r>
-        <w:t xml:space="preserve">dvendig informasjon trekker ned. </w:t>
-      </w:r>
-      <w:r>
-        <w:t xml:space="preserve">Man kan gjerne beskrive </w:t>
-      </w:r>
-      <w:r>
-        <w:t xml:space="preserve">om </w:t>
-      </w:r>
-      <w:r>
-        <w:t>en bransje</w:t>
-      </w:r>
-      <w:r>
-        <w:t xml:space="preserve"> eller </w:t>
-      </w:r>
-      <w:r>
-        <w:t xml:space="preserve">en </w:t>
-      </w:r>
-      <w:r>
-        <w:t>teori</w:t>
-      </w:r>
-      <w:r>
-        <w:t xml:space="preserve"> hvis problemstillingen ikke </w:t>
-      </w:r>
-      <w:r>
-        <w:t>omhandler en spesifikk bedrift.</w:t>
-      </w:r>
-    </w:p>
-    <w:p/>
-    <w:p>
-      <w:r>
-        <w:t>Anta vi f.ek</w:t>
-      </w:r>
-      <w:r>
-        <w:t xml:space="preserve">s. har som problemstilling og forbedre gjennomløpstiden for </w:t>
-      </w:r>
-      <w:r>
-        <w:t>en vare i en produksjonsbedrift:</w:t>
-      </w:r>
-    </w:p>
-    <w:p/>
-    <w:p>
-      <w:pPr>
-        <w:pStyle w:val="Listeavsnitt"/>
-        <w:numPr>
-          <w:ilvl w:val="0"/>
-          <w:numId w:val="32"/>
-        </w:numPr>
-      </w:pPr>
-      <w:r>
-        <w:t xml:space="preserve">Type bedrift og hvorfor </w:t>
-      </w:r>
-      <w:r>
-        <w:t>produktet</w:t>
-      </w:r>
-      <w:r>
-        <w:t xml:space="preserve"> </w:t>
-      </w:r>
-      <w:r>
-        <w:t xml:space="preserve">har </w:t>
-      </w:r>
-      <w:r>
-        <w:t>lav</w:t>
-      </w:r>
-      <w:r>
-        <w:t xml:space="preserve"> gjennomløpstid</w:t>
-      </w:r>
-      <w:r>
-        <w:t>.</w:t>
-      </w:r>
-    </w:p>
-    <w:p>
-      <w:pPr>
-        <w:pStyle w:val="Listeavsnitt"/>
-        <w:numPr>
-          <w:ilvl w:val="0"/>
-          <w:numId w:val="32"/>
-        </w:numPr>
-      </w:pPr>
-      <w:r>
-        <w:t>Beskrivelse av produktets oppbygning i komponenter</w:t>
-      </w:r>
-      <w:r>
-        <w:t>.</w:t>
-      </w:r>
-    </w:p>
-    <w:p>
-      <w:pPr>
-        <w:pStyle w:val="Listeavsnitt"/>
-        <w:numPr>
-          <w:ilvl w:val="0"/>
-          <w:numId w:val="32"/>
-        </w:numPr>
-      </w:pPr>
-      <w:r>
-        <w:t>Hvordan bedriften gjennomfører produksjonen av produktet i dag?</w:t>
-      </w:r>
-    </w:p>
-    <w:p>
-      <w:pPr>
-        <w:pStyle w:val="Listeavsnitt"/>
-        <w:numPr>
-          <w:ilvl w:val="0"/>
-          <w:numId w:val="32"/>
-        </w:numPr>
-      </w:pPr>
-      <w:r>
-        <w:t xml:space="preserve">Hvilke faktorer som påvirker </w:t>
-      </w:r>
-      <w:r>
-        <w:t>gjennomløpstiden</w:t>
-      </w:r>
-      <w:r>
-        <w:t>.</w:t>
-      </w:r>
-    </w:p>
-    <w:p>
-      <w:pPr>
-        <w:pStyle w:val="Listeavsnitt"/>
-        <w:numPr>
-          <w:ilvl w:val="0"/>
-          <w:numId w:val="32"/>
-        </w:numPr>
-      </w:pPr>
-      <w:r>
-        <w:t>Hvilke data som bedriften har for prosessen</w:t>
-      </w:r>
-      <w:r>
-        <w:t>.</w:t>
-      </w:r>
-    </w:p>
-    <w:p>
-      <w:pPr>
-        <w:pStyle w:val="Listeavsnitt"/>
-        <w:numPr>
-          <w:ilvl w:val="0"/>
-          <w:numId w:val="32"/>
-        </w:numPr>
-      </w:pPr>
-      <w:r>
-        <w:t>Hv</w:t>
-      </w:r>
-      <w:r>
-        <w:t>a bedriften tror som forårsaker lav gjennomløpstid.</w:t>
-      </w:r>
-    </w:p>
-    <w:p/>
-    <w:p>
-      <w:pPr>
-        <w:pStyle w:val="Overskrift1"/>
-      </w:pPr>
-      <w:bookmarkStart w:id="24" w:name="_Toc222057411"/>
-      <w:r>
-        <w:t>Metode og data</w:t>
-      </w:r>
-      <w:r>
-        <w:t xml:space="preserve"> (kan splittes i to)</w:t>
-      </w:r>
-      <w:bookmarkEnd w:id="24"/>
-    </w:p>
-    <w:p>
-      <w:r>
-        <w:t xml:space="preserve">Litt avhengig av </w:t>
-      </w:r>
-      <w:r>
-        <w:t>omfanget</w:t>
-      </w:r>
-      <w:r>
-        <w:t xml:space="preserve">, kan det være </w:t>
-      </w:r>
-      <w:r>
-        <w:t>lurt å vurdere om du skal splitte kapittelet i to eller ikke.</w:t>
-      </w:r>
-    </w:p>
-    <w:p>
-      <w:pPr>
-        <w:pStyle w:val="Overskrift2"/>
-      </w:pPr>
-      <w:bookmarkStart w:id="25" w:name="_Toc222057412"/>
-      <w:r>
-        <w:t>Metode</w:t>
-      </w:r>
-      <w:bookmarkEnd w:id="25"/>
-    </w:p>
-    <w:p>
-      <w:r>
-        <w:t>I oppgavens metodedel skal du beskrive valgt metode. Dette skal beskrives så nøyaktig at andre skal kunne klare å gjenta prosessen. Metodedelen gir leseren mulighet til å vurdere hvorvidt oppgaven kan inneholde feil i fremgangsmåten.</w:t>
-      </w:r>
-    </w:p>
-    <w:p>
-      <w:pPr>
-        <w:rPr>
-          <w:lang w:eastAsia="nb-NO" w:bidi="ar-SA"/>
-        </w:rPr>
-      </w:pPr>
-    </w:p>
-    <w:p>
-      <w:r>
-        <w:t>Oppgi paradigme betraktninger, forskningsperspektiv, forskningsdesign, innsamlingsmetode for data, utvalgskriterier, utvalgsmetode, utvalgsstørrelse og analysemetoder.</w:t>
-      </w:r>
-    </w:p>
-    <w:p/>
-    <w:p>
-      <w:r>
-        <w:t xml:space="preserve">Du kan også ta opp eventuelle etiske spørsmål og </w:t>
-      </w:r>
-      <w:proofErr w:type="gramStart"/>
-      <w:r>
-        <w:t>potensielle</w:t>
-      </w:r>
-      <w:proofErr w:type="gramEnd"/>
-      <w:r>
-        <w:t xml:space="preserve"> feilkilder.</w:t>
-      </w:r>
-    </w:p>
-    <w:p/>
-    <w:p>
-      <w:r>
-        <w:t>Eksempel:</w:t>
-      </w:r>
-    </w:p>
-    <w:p>
-      <w:pPr>
-        <w:numPr>
-          <w:ilvl w:val="0"/>
-          <w:numId w:val="38"/>
-        </w:numPr>
-      </w:pPr>
-      <w:r>
-        <w:t>Hvilken forskningsmetode er valgt?</w:t>
-      </w:r>
-    </w:p>
-    <w:p>
-      <w:pPr>
-        <w:numPr>
-          <w:ilvl w:val="1"/>
-          <w:numId w:val="38"/>
-        </w:numPr>
-      </w:pPr>
-      <w:r>
-        <w:t xml:space="preserve">For de fleste er det </w:t>
-      </w:r>
-      <w:proofErr w:type="gramStart"/>
-      <w:r>
-        <w:t>case</w:t>
-      </w:r>
-      <w:proofErr w:type="gramEnd"/>
-      <w:r>
-        <w:t>-metode</w:t>
-      </w:r>
-    </w:p>
-    <w:p>
-      <w:pPr>
-        <w:numPr>
-          <w:ilvl w:val="0"/>
-          <w:numId w:val="38"/>
-        </w:numPr>
-      </w:pPr>
-      <w:r>
-        <w:t>Kvantitativ eller kvalitativ?</w:t>
-      </w:r>
-    </w:p>
-    <w:p>
-      <w:pPr>
-        <w:numPr>
-          <w:ilvl w:val="1"/>
-          <w:numId w:val="38"/>
-        </w:numPr>
-      </w:pPr>
-      <w:r>
-        <w:t>Hva slags data (spørreskjema, intervju, fra ERP systemet)</w:t>
-      </w:r>
-    </w:p>
-    <w:p>
-      <w:pPr>
-        <w:numPr>
-          <w:ilvl w:val="2"/>
-          <w:numId w:val="38"/>
-        </w:numPr>
-      </w:pPr>
-      <w:r>
-        <w:t>Teori rundt det å lage spørreskjema</w:t>
-      </w:r>
-    </w:p>
-    <w:p>
-      <w:pPr>
-        <w:numPr>
-          <w:ilvl w:val="2"/>
-          <w:numId w:val="38"/>
-        </w:numPr>
-      </w:pPr>
-      <w:r>
-        <w:t>Teori rundt det med nøyaktigheten av data fra ERP system</w:t>
-      </w:r>
-    </w:p>
-    <w:p>
-      <w:pPr>
-        <w:numPr>
-          <w:ilvl w:val="1"/>
-          <w:numId w:val="38"/>
-        </w:numPr>
-      </w:pPr>
-      <w:r>
-        <w:t>Metode for analyse, kvantitativ, kvalitativ</w:t>
-      </w:r>
-    </w:p>
-    <w:p>
-      <w:pPr>
-        <w:numPr>
-          <w:ilvl w:val="2"/>
-          <w:numId w:val="38"/>
-        </w:numPr>
-      </w:pPr>
-      <w:r>
-        <w:t>Kort beskrivelse av den metoden som er valgt</w:t>
-      </w:r>
-    </w:p>
-    <w:p>
-      <w:pPr>
-        <w:numPr>
-          <w:ilvl w:val="2"/>
-          <w:numId w:val="38"/>
-        </w:numPr>
-      </w:pPr>
-      <w:r>
-        <w:t>Statistisk metode? regresjon?</w:t>
-      </w:r>
-    </w:p>
-    <w:p>
-      <w:pPr>
-        <w:numPr>
-          <w:ilvl w:val="2"/>
-          <w:numId w:val="38"/>
-        </w:numPr>
-      </w:pPr>
-      <w:r>
-        <w:t>Kort beskrivelse (bruk lærebøker)</w:t>
-      </w:r>
-    </w:p>
-    <w:p>
-      <w:pPr>
-        <w:numPr>
-          <w:ilvl w:val="2"/>
-          <w:numId w:val="38"/>
-        </w:numPr>
-      </w:pPr>
-      <w:r>
-        <w:t xml:space="preserve">Dataverktøy for eksempel SPSS eller </w:t>
-      </w:r>
-      <w:proofErr w:type="spellStart"/>
-      <w:r>
-        <w:t>excel</w:t>
-      </w:r>
-      <w:proofErr w:type="spellEnd"/>
-    </w:p>
-    <w:p/>
-    <w:p/>
-    <w:p/>
-    <w:p/>
-    <w:p>
-      <w:pPr>
-        <w:pStyle w:val="Overskrift2"/>
-      </w:pPr>
-      <w:bookmarkStart w:id="26" w:name="_Toc222057413"/>
-      <w:r>
-        <w:t>Data</w:t>
-      </w:r>
-      <w:bookmarkEnd w:id="26"/>
-    </w:p>
-    <w:p>
-      <w:r>
-        <w:t xml:space="preserve">Her beskriver du hvilke data du har brukt, hvordan du har fått tak i </w:t>
-      </w:r>
-      <w:proofErr w:type="gramStart"/>
-      <w:r>
-        <w:t>de</w:t>
-      </w:r>
-      <w:proofErr w:type="gramEnd"/>
-      <w:r>
-        <w:t xml:space="preserve"> og hvordan leser evt. kan få tak i dataene om nødvendig.</w:t>
-      </w:r>
-    </w:p>
-    <w:p/>
-    <w:p>
-      <w:r>
-        <w:t xml:space="preserve">Hvordan er </w:t>
-      </w:r>
-      <w:r>
-        <w:t>data</w:t>
-      </w:r>
-      <w:r>
-        <w:t xml:space="preserve"> samlet inn:</w:t>
-      </w:r>
-    </w:p>
-    <w:p/>
-    <w:p>
-      <w:pPr>
-        <w:pStyle w:val="Listeavsnitt"/>
-        <w:numPr>
-          <w:ilvl w:val="0"/>
-          <w:numId w:val="36"/>
-        </w:numPr>
-      </w:pPr>
-      <w:r>
-        <w:t>Tidsperiode</w:t>
-      </w:r>
-    </w:p>
-    <w:p>
-      <w:pPr>
-        <w:pStyle w:val="Listeavsnitt"/>
-        <w:numPr>
-          <w:ilvl w:val="0"/>
-          <w:numId w:val="36"/>
-        </w:numPr>
-      </w:pPr>
-      <w:r>
-        <w:t>Intervju</w:t>
-      </w:r>
-      <w:r>
-        <w:t xml:space="preserve"> – </w:t>
-      </w:r>
-      <w:r>
-        <w:t>hvor mange</w:t>
-      </w:r>
-      <w:r>
-        <w:t xml:space="preserve"> og til </w:t>
-      </w:r>
-      <w:r>
-        <w:t>hvem? (Hvorfor ble disse valgt som intervjuobjekt)</w:t>
-      </w:r>
-    </w:p>
-    <w:p>
-      <w:pPr>
-        <w:pStyle w:val="Listeavsnitt"/>
-        <w:numPr>
-          <w:ilvl w:val="0"/>
-          <w:numId w:val="36"/>
-        </w:numPr>
-      </w:pPr>
-      <w:r>
-        <w:lastRenderedPageBreak/>
-        <w:t>Spørreskjema</w:t>
-      </w:r>
-      <w:r>
-        <w:t xml:space="preserve"> – </w:t>
-      </w:r>
-      <w:r>
-        <w:t>hvor mange er det sent til</w:t>
-      </w:r>
-      <w:r>
-        <w:t xml:space="preserve">, </w:t>
-      </w:r>
-      <w:r>
-        <w:t>hvor mange fikk dere inn</w:t>
-      </w:r>
-      <w:r>
-        <w:t xml:space="preserve">, </w:t>
-      </w:r>
-      <w:r>
-        <w:t>hvor mange kunne dere bruke</w:t>
-      </w:r>
-      <w:r>
-        <w:t xml:space="preserve"> – </w:t>
-      </w:r>
-      <w:r>
-        <w:t>hvem sendte dere til</w:t>
-      </w:r>
-      <w:r>
-        <w:t xml:space="preserve"> – </w:t>
-      </w:r>
-      <w:r>
-        <w:t>er det flere versjoner</w:t>
-      </w:r>
-      <w:r>
-        <w:t>?</w:t>
-      </w:r>
-    </w:p>
-    <w:p>
-      <w:pPr>
-        <w:pStyle w:val="Listeavsnitt"/>
-        <w:numPr>
-          <w:ilvl w:val="0"/>
-          <w:numId w:val="36"/>
-        </w:numPr>
-      </w:pPr>
-      <w:r>
-        <w:t>Data fra ERP-systemet: Periode-antall observasjoner rå data</w:t>
-      </w:r>
-      <w:r>
-        <w:t xml:space="preserve">, </w:t>
-      </w:r>
-      <w:r>
-        <w:t xml:space="preserve">antall observasjoner etter </w:t>
-      </w:r>
-      <w:proofErr w:type="spellStart"/>
-      <w:r>
-        <w:t>cleaning</w:t>
-      </w:r>
-      <w:proofErr w:type="spellEnd"/>
-      <w:r>
-        <w:t>.</w:t>
-      </w:r>
-    </w:p>
-    <w:p>
-      <w:pPr>
-        <w:pStyle w:val="Overskrift1"/>
-      </w:pPr>
-      <w:bookmarkStart w:id="27" w:name="_Toc222057414"/>
-      <w:r>
-        <w:t>Modellering</w:t>
-      </w:r>
-      <w:bookmarkEnd w:id="27"/>
-    </w:p>
-    <w:p/>
-    <w:p>
-      <w:pPr>
-        <w:pStyle w:val="Overskrift1"/>
-      </w:pPr>
-      <w:bookmarkStart w:id="28" w:name="_Toc222057415"/>
-      <w:r>
-        <w:t>Analyse</w:t>
-      </w:r>
-      <w:bookmarkEnd w:id="28"/>
-    </w:p>
-    <w:p>
-      <w:pPr>
-        <w:rPr>
-          <w:lang w:eastAsia="nb-NO" w:bidi="ar-SA"/>
-        </w:rPr>
-      </w:pPr>
-      <w:r>
-        <w:rPr>
-          <w:lang w:eastAsia="nb-NO" w:bidi="ar-SA"/>
-        </w:rPr>
-        <w:t>Hvordan skrive bacheloroppgave etter at metodedelen er laget? Jo, du lager en analyse!</w:t>
-      </w:r>
-    </w:p>
-    <w:p>
-      <w:pPr>
-        <w:rPr>
-          <w:lang w:eastAsia="nb-NO" w:bidi="ar-SA"/>
-        </w:rPr>
-      </w:pPr>
-      <w:r>
-        <w:rPr>
-          <w:lang w:eastAsia="nb-NO" w:bidi="ar-SA"/>
-        </w:rPr>
-        <w:t>Dette er siste bit før du kan presentere selve resultatene av studiene. Du kan velge mellom forskjellige metoder, nemlig</w:t>
-      </w:r>
-      <w:r>
-        <w:rPr>
-          <w:lang w:eastAsia="nb-NO" w:bidi="ar-SA"/>
-        </w:rPr>
-        <w:t>:</w:t>
-      </w:r>
-    </w:p>
-    <w:p>
-      <w:pPr>
-        <w:rPr>
-          <w:lang w:eastAsia="nb-NO" w:bidi="ar-SA"/>
-        </w:rPr>
-      </w:pPr>
-    </w:p>
-    <w:p>
-      <w:pPr>
-        <w:pStyle w:val="Listeavsnitt"/>
-        <w:numPr>
-          <w:ilvl w:val="0"/>
-          <w:numId w:val="37"/>
-        </w:numPr>
-        <w:rPr>
-          <w:lang w:eastAsia="nb-NO" w:bidi="ar-SA"/>
-        </w:rPr>
-      </w:pPr>
-      <w:r>
-        <w:rPr>
-          <w:lang w:eastAsia="nb-NO" w:bidi="ar-SA"/>
-        </w:rPr>
-        <w:t>Kvalitativ metode (intervju eller lignende)</w:t>
-      </w:r>
-    </w:p>
-    <w:p>
-      <w:pPr>
-        <w:pStyle w:val="Listeavsnitt"/>
-        <w:numPr>
-          <w:ilvl w:val="0"/>
-          <w:numId w:val="37"/>
-        </w:numPr>
-        <w:rPr>
-          <w:lang w:eastAsia="nb-NO" w:bidi="ar-SA"/>
-        </w:rPr>
-      </w:pPr>
-      <w:r>
-        <w:rPr>
-          <w:lang w:eastAsia="nb-NO" w:bidi="ar-SA"/>
-        </w:rPr>
-        <w:t>Kvantitativ metode</w:t>
-      </w:r>
-    </w:p>
-    <w:p>
-      <w:pPr>
-        <w:pStyle w:val="Listeavsnitt"/>
-        <w:numPr>
-          <w:ilvl w:val="0"/>
-          <w:numId w:val="37"/>
-        </w:numPr>
-        <w:rPr>
-          <w:lang w:eastAsia="nb-NO" w:bidi="ar-SA"/>
-        </w:rPr>
-      </w:pPr>
-      <w:r>
-        <w:rPr>
-          <w:lang w:eastAsia="nb-NO" w:bidi="ar-SA"/>
-        </w:rPr>
-        <w:t>Dokumentanalyse</w:t>
-      </w:r>
-    </w:p>
-    <w:p>
-      <w:pPr>
-        <w:rPr>
-          <w:lang w:eastAsia="nb-NO" w:bidi="ar-SA"/>
-        </w:rPr>
-      </w:pPr>
-    </w:p>
-    <w:p>
-      <w:pPr>
-        <w:rPr>
-          <w:lang w:eastAsia="nb-NO" w:bidi="ar-SA"/>
-        </w:rPr>
-      </w:pPr>
-      <w:r>
-        <w:rPr>
-          <w:lang w:eastAsia="nb-NO" w:bidi="ar-SA"/>
-        </w:rPr>
-        <w:t>Prat gjerne med veilederen din om du er usikker på hvilken metode som er best for akkurat din problemstilling.</w:t>
-      </w:r>
-    </w:p>
-    <w:p/>
-    <w:p>
-      <w:pPr>
-        <w:pStyle w:val="Overskrift1"/>
-      </w:pPr>
-      <w:bookmarkStart w:id="29" w:name="_Toc222057416"/>
-      <w:r>
-        <w:t>Resultat</w:t>
-      </w:r>
-      <w:bookmarkEnd w:id="29"/>
-    </w:p>
-    <w:p>
-      <w:r>
-        <w:t>Den kanskje viktigste delen når du skal skrive en bacheloroppgave, er resultatdelen. Her beskriver du alle funnene som er gjort i analyser og studier.</w:t>
-      </w:r>
-    </w:p>
-    <w:p>
-      <w:pPr>
-        <w:rPr>
-          <w:lang w:eastAsia="nb-NO" w:bidi="ar-SA"/>
-        </w:rPr>
-      </w:pPr>
-    </w:p>
-    <w:p>
-      <w:r>
-        <w:t>Det er viktig at du presenterer resultatene på en klar og tydelig måte – gjerne ved bruk av tabeller og figurer.</w:t>
-      </w:r>
-    </w:p>
-    <w:p>
-      <w:r>
-        <w:t>Noen viktige punkter:</w:t>
-      </w:r>
-    </w:p>
-    <w:p/>
-    <w:p>
-      <w:pPr>
-        <w:numPr>
-          <w:ilvl w:val="0"/>
-          <w:numId w:val="39"/>
-        </w:numPr>
-      </w:pPr>
-      <w:r>
-        <w:t>Dersom dette er et eget kapittel så skal dere her kun presentere resultatene i form av tabeller og/eller figurer.</w:t>
-      </w:r>
-    </w:p>
-    <w:p>
-      <w:pPr>
-        <w:numPr>
-          <w:ilvl w:val="0"/>
-          <w:numId w:val="39"/>
-        </w:numPr>
-      </w:pPr>
-      <w:r>
-        <w:t>Tabeller: Oppsummerte resultater</w:t>
-      </w:r>
-    </w:p>
-    <w:p>
-      <w:pPr>
-        <w:numPr>
-          <w:ilvl w:val="0"/>
-          <w:numId w:val="39"/>
-        </w:numPr>
-      </w:pPr>
-      <w:r>
-        <w:t>Resultatene er direkte linket til forskningsspørsmålet!</w:t>
-      </w:r>
-    </w:p>
-    <w:p>
-      <w:pPr>
-        <w:numPr>
-          <w:ilvl w:val="1"/>
-          <w:numId w:val="39"/>
-        </w:numPr>
-      </w:pPr>
-      <w:r>
-        <w:lastRenderedPageBreak/>
-        <w:t>Dersom det ikke er det så er det to alternativer:</w:t>
-      </w:r>
-    </w:p>
-    <w:p>
-      <w:pPr>
-        <w:numPr>
-          <w:ilvl w:val="2"/>
-          <w:numId w:val="39"/>
-        </w:numPr>
-      </w:pPr>
-      <w:r>
-        <w:t>Kjør analysene på nytt i henhold til forskningsspørsmålet</w:t>
-      </w:r>
-    </w:p>
-    <w:p>
-      <w:pPr>
-        <w:numPr>
-          <w:ilvl w:val="2"/>
-          <w:numId w:val="39"/>
-        </w:numPr>
-      </w:pPr>
-      <w:r>
-        <w:t>Endre forskningsspørsmålet slik at det er samsvar med analysene</w:t>
-      </w:r>
-    </w:p>
-    <w:p>
-      <w:pPr>
-        <w:numPr>
-          <w:ilvl w:val="0"/>
-          <w:numId w:val="39"/>
-        </w:numPr>
-      </w:pPr>
-      <w:r>
-        <w:t>NB: En forklarende tekst for hver tabell og hver figur!</w:t>
-      </w:r>
-    </w:p>
-    <w:p>
-      <w:pPr>
-        <w:numPr>
-          <w:ilvl w:val="1"/>
-          <w:numId w:val="39"/>
-        </w:numPr>
-      </w:pPr>
-      <w:r>
-        <w:t>Som regel kommer teksten før tabellen/figuren, men noen ganger etter og noen ganger litt tekst først og litt etter tabellen/figuren.</w:t>
-      </w:r>
-    </w:p>
-    <w:p>
-      <w:pPr>
-        <w:numPr>
-          <w:ilvl w:val="1"/>
-          <w:numId w:val="39"/>
-        </w:numPr>
-      </w:pPr>
-      <w:r>
-        <w:t>Dere vil synes at det er overflødig med forklarende tekst, men det må gjøres og kun det som dere ser: en objektiv presentasjon.</w:t>
-      </w:r>
-    </w:p>
-    <w:p/>
-    <w:p/>
-    <w:p>
-      <w:pPr>
-        <w:pStyle w:val="Overskrift1"/>
-      </w:pPr>
-      <w:bookmarkStart w:id="30" w:name="_Toc222057417"/>
-      <w:r>
-        <w:t>Diskusjon</w:t>
-      </w:r>
-      <w:bookmarkEnd w:id="30"/>
-    </w:p>
-    <w:p>
-      <w:pPr>
-        <w:rPr>
-          <w:lang w:eastAsia="nb-NO" w:bidi="ar-SA"/>
-        </w:rPr>
-      </w:pPr>
-      <w:r>
-        <w:t>I diskusjonsdelen skal du diskutere de forskjellige funnene du har gjort. Her skal du blant annet inkludere en kritisk metodediskusjon, der du vurderer om metoden din var riktig.</w:t>
-      </w:r>
-    </w:p>
-    <w:p>
-      <w:r>
-        <w:t>Diskuter hvor pålitelige funnene dine er, om de er generaliserbare og eventuelle svakheter. Forklar også hvorvidt studiet har gitt ny teoretisk innsikt, og om hypoteser kan avkreftes.</w:t>
-      </w:r>
-    </w:p>
-    <w:p/>
-    <w:p>
-      <w:r>
-        <w:t>Noen viktige punkter:</w:t>
-      </w:r>
-    </w:p>
-    <w:p/>
-    <w:p>
-      <w:pPr>
-        <w:numPr>
-          <w:ilvl w:val="0"/>
-          <w:numId w:val="40"/>
-        </w:numPr>
-      </w:pPr>
-      <w:r>
-        <w:t>Her skal resultatene diskuteres</w:t>
-      </w:r>
-    </w:p>
-    <w:p>
-      <w:pPr>
-        <w:numPr>
-          <w:ilvl w:val="1"/>
-          <w:numId w:val="40"/>
-        </w:numPr>
-      </w:pPr>
-      <w:r>
-        <w:t xml:space="preserve">Studenter blander ofte sammen diskusjon og </w:t>
-      </w:r>
-      <w:proofErr w:type="gramStart"/>
-      <w:r>
-        <w:t>resultater...</w:t>
-      </w:r>
-      <w:proofErr w:type="gramEnd"/>
-    </w:p>
-    <w:p>
-      <w:pPr>
-        <w:numPr>
-          <w:ilvl w:val="0"/>
-          <w:numId w:val="40"/>
-        </w:numPr>
-      </w:pPr>
-      <w:r>
-        <w:t>Her skal dere kommentere de resultatene som dere har funnet</w:t>
-      </w:r>
-    </w:p>
-    <w:p>
-      <w:pPr>
-        <w:numPr>
-          <w:ilvl w:val="1"/>
-          <w:numId w:val="40"/>
-        </w:numPr>
-      </w:pPr>
-      <w:r>
-        <w:t>Er dette som forventet?</w:t>
-      </w:r>
-    </w:p>
-    <w:p>
-      <w:pPr>
-        <w:numPr>
-          <w:ilvl w:val="1"/>
-          <w:numId w:val="40"/>
-        </w:numPr>
-      </w:pPr>
-      <w:r>
-        <w:t>Uventede funn? Hvis ja hvordan kan dere forklare dette</w:t>
-      </w:r>
-    </w:p>
-    <w:p>
-      <w:pPr>
-        <w:numPr>
-          <w:ilvl w:val="0"/>
-          <w:numId w:val="40"/>
-        </w:numPr>
-      </w:pPr>
-      <w:r>
-        <w:t>Stemmer deres resultater med forskningslitteraturen?</w:t>
-      </w:r>
-    </w:p>
-    <w:p>
-      <w:pPr>
-        <w:numPr>
-          <w:ilvl w:val="1"/>
-          <w:numId w:val="40"/>
-        </w:numPr>
-      </w:pPr>
-      <w:r>
-        <w:t xml:space="preserve">Hvis ikke, hvorfor ikke? Og det kan være bra! </w:t>
-      </w:r>
-    </w:p>
-    <w:p>
-      <w:pPr>
-        <w:numPr>
-          <w:ilvl w:val="1"/>
-          <w:numId w:val="40"/>
-        </w:numPr>
-      </w:pPr>
-      <w:r>
-        <w:t>Hvis ja, kan dere henvise til forskningslitteraturen for å understøtte deres resultater</w:t>
-      </w:r>
-    </w:p>
-    <w:p>
-      <w:pPr>
-        <w:numPr>
-          <w:ilvl w:val="0"/>
-          <w:numId w:val="40"/>
-        </w:numPr>
-      </w:pPr>
-      <w:r>
-        <w:t xml:space="preserve">Resultatene diskuteres opp mot </w:t>
-      </w:r>
-      <w:proofErr w:type="gramStart"/>
-      <w:r>
-        <w:t>problemstillingen!•</w:t>
-      </w:r>
-      <w:proofErr w:type="gramEnd"/>
-      <w:r>
-        <w:t>Har dere fått svar på forskningsspørsmålet?</w:t>
-      </w:r>
-    </w:p>
-    <w:p>
-      <w:pPr>
-        <w:numPr>
-          <w:ilvl w:val="0"/>
-          <w:numId w:val="40"/>
-        </w:numPr>
-      </w:pPr>
-      <w:r>
-        <w:t>Hvilken betydning for næringslivet?</w:t>
-      </w:r>
-    </w:p>
-    <w:p>
-      <w:pPr>
-        <w:numPr>
-          <w:ilvl w:val="0"/>
-          <w:numId w:val="40"/>
-        </w:numPr>
-      </w:pPr>
-      <w:r>
-        <w:t>Anbefales som eget punkt i diskusjonen (dette er et viktig punkt i oppgaven)</w:t>
-      </w:r>
-    </w:p>
-    <w:p>
-      <w:pPr>
-        <w:numPr>
-          <w:ilvl w:val="0"/>
-          <w:numId w:val="40"/>
-        </w:numPr>
-      </w:pPr>
-      <w:r>
-        <w:t>Hva medfører deres resultater for næringslivet/bedriften?</w:t>
-      </w:r>
-    </w:p>
-    <w:p>
-      <w:pPr>
-        <w:numPr>
-          <w:ilvl w:val="0"/>
-          <w:numId w:val="40"/>
-        </w:numPr>
-      </w:pPr>
-      <w:r>
-        <w:lastRenderedPageBreak/>
-        <w:t>Hvilke endringer bør bedriften/næringslivet gjøre?</w:t>
-      </w:r>
-    </w:p>
-    <w:p>
-      <w:pPr>
-        <w:numPr>
-          <w:ilvl w:val="0"/>
-          <w:numId w:val="40"/>
-        </w:numPr>
-      </w:pPr>
-      <w:r>
-        <w:t>Mulig å generalisere?</w:t>
-      </w:r>
-    </w:p>
-    <w:p>
-      <w:pPr>
-        <w:numPr>
-          <w:ilvl w:val="0"/>
-          <w:numId w:val="40"/>
-        </w:numPr>
-      </w:pPr>
-      <w:r>
-        <w:t>Ta med begrensinger/svakheter i oppgaven</w:t>
-      </w:r>
-    </w:p>
-    <w:p>
-      <w:pPr>
-        <w:numPr>
-          <w:ilvl w:val="0"/>
-          <w:numId w:val="40"/>
-        </w:numPr>
-      </w:pPr>
-      <w:r>
-        <w:t xml:space="preserve">Ikke overfokuser på dette </w:t>
-      </w:r>
-      <w:proofErr w:type="gramStart"/>
-      <w:r>
-        <w:t>punktet</w:t>
-      </w:r>
-      <w:proofErr w:type="gramEnd"/>
-      <w:r>
-        <w:t xml:space="preserve"> men vær ærlige</w:t>
-      </w:r>
-    </w:p>
-    <w:p/>
-    <w:p>
-      <w:pPr>
-        <w:pStyle w:val="Overskrift1"/>
-      </w:pPr>
-      <w:bookmarkStart w:id="31" w:name="_Toc222057418"/>
-      <w:r>
-        <w:t>Konklusjon</w:t>
-      </w:r>
-      <w:bookmarkEnd w:id="31"/>
-    </w:p>
-    <w:p/>
-    <w:p>
-      <w:pPr>
-        <w:rPr>
-          <w:lang w:eastAsia="nb-NO" w:bidi="ar-SA"/>
-        </w:rPr>
-      </w:pPr>
-      <w:r>
-        <w:t>I oppgavens konklusjon oppsummerer du hovedfunn sett i forhold til problemstilling.</w:t>
-      </w:r>
-    </w:p>
-    <w:p>
-      <w:r>
-        <w:t>Avslutt gjerne med spørsmål til videre forskning, og del personlige refleksjoner du eventuelt måtte ha.</w:t>
-      </w:r>
-    </w:p>
-    <w:p/>
-    <w:p>
-      <w:r>
-        <w:t>Hva er det viktigste dere har funnet?</w:t>
-      </w:r>
-    </w:p>
-    <w:p>
-      <w:pPr>
-        <w:numPr>
-          <w:ilvl w:val="0"/>
-          <w:numId w:val="42"/>
-        </w:numPr>
-      </w:pPr>
-      <w:r>
-        <w:t>Konkludere i henhold til oppgavens problemstilling. Ofte begynner en konklusjon med å gjenta forskningsspørsmålet:</w:t>
-      </w:r>
-    </w:p>
-    <w:p>
-      <w:pPr>
-        <w:numPr>
-          <w:ilvl w:val="1"/>
-          <w:numId w:val="42"/>
-        </w:numPr>
-      </w:pPr>
-      <w:r>
-        <w:t>«</w:t>
-      </w:r>
-      <w:r>
-        <w:t xml:space="preserve">I denne oppgaven har analysert/redegjort </w:t>
-      </w:r>
-      <w:proofErr w:type="gramStart"/>
-      <w:r>
-        <w:t>for...</w:t>
-      </w:r>
-      <w:proofErr w:type="gramEnd"/>
-      <w:r>
-        <w:t>»</w:t>
-      </w:r>
-      <w:r>
-        <w:t>.</w:t>
-      </w:r>
-    </w:p>
-    <w:p>
-      <w:pPr>
-        <w:numPr>
-          <w:ilvl w:val="1"/>
-          <w:numId w:val="42"/>
-        </w:numPr>
-      </w:pPr>
-      <w:r>
-        <w:t>«</w:t>
-      </w:r>
-      <w:r>
-        <w:t>Hovedfunnene i oppgaven viser at</w:t>
-      </w:r>
-      <w:proofErr w:type="gramStart"/>
-      <w:r>
-        <w:t xml:space="preserve"> ....</w:t>
-      </w:r>
-      <w:proofErr w:type="gramEnd"/>
-      <w:r>
-        <w:t>»</w:t>
-      </w:r>
-    </w:p>
-    <w:p>
-      <w:pPr>
-        <w:numPr>
-          <w:ilvl w:val="1"/>
-          <w:numId w:val="42"/>
-        </w:numPr>
-      </w:pPr>
-      <w:r>
-        <w:t>«</w:t>
-      </w:r>
-      <w:r>
-        <w:t>På tross av de svakhetene som oppgaven har er det indikasjoner om at ...</w:t>
-      </w:r>
-      <w:r>
-        <w:t>»</w:t>
-      </w:r>
-    </w:p>
-    <w:p>
-      <w:pPr>
-        <w:numPr>
-          <w:ilvl w:val="0"/>
-          <w:numId w:val="42"/>
-        </w:numPr>
-      </w:pPr>
-      <w:r>
-        <w:t>I konklusjonen blir det ofte litt gjentagelse fra diskusjon/</w:t>
-      </w:r>
-      <w:proofErr w:type="gramStart"/>
-      <w:r>
-        <w:t>resultat</w:t>
-      </w:r>
-      <w:proofErr w:type="gramEnd"/>
-      <w:r>
-        <w:t xml:space="preserve"> men det er helt greit. Her skal dere dra frem de viktigste funnene og hvilken betydning det har for deres </w:t>
-      </w:r>
-      <w:proofErr w:type="gramStart"/>
-      <w:r>
-        <w:t>case</w:t>
-      </w:r>
-      <w:proofErr w:type="gramEnd"/>
-      <w:r>
-        <w:t>.</w:t>
-      </w:r>
-    </w:p>
-    <w:p/>
-    <w:p/>
-    <w:p>
-      <w:pPr>
-        <w:pStyle w:val="Overskrift1"/>
-      </w:pPr>
-      <w:bookmarkStart w:id="32" w:name="_Toc222057419"/>
-      <w:r>
-        <w:t>Bibliografi</w:t>
-      </w:r>
-      <w:bookmarkEnd w:id="32"/>
-    </w:p>
-    <w:p>
-      <w:pPr>
-        <w:pStyle w:val="Overskrift1"/>
-      </w:pPr>
-      <w:bookmarkStart w:id="33" w:name="_Toc222057420"/>
-      <w:r>
-        <w:t>Vedlegg</w:t>
-      </w:r>
-      <w:bookmarkEnd w:id="33"/>
-    </w:p>
     <w:p/>
     <w:sectPr>
       <w:pgSz w:w="11907" w:h="16840"/>
       <w:pgMar w:top="1411" w:right="1411" w:bottom="1411" w:left="1728" w:header="720" w:footer="403" w:gutter="0"/>
-      <w:pgNumType w:start="1"/>
       <w:cols w:space="720"/>
       <w:formProt w:val="0"/>
+      <w:titlePg/>
     </w:sectPr>
   </w:body>
 </w:document>
@@ -14189,6 +10088,21 @@
 </file>
 
 <file path=customXml/item2.xml><?xml version="1.0" encoding="utf-8"?>
+<?mso-contentType ?>
+<FormTemplates xmlns="http://schemas.microsoft.com/sharepoint/v3/contenttype/forms">
+  <Display>DocumentLibraryForm</Display>
+  <Edit>DocumentLibraryForm</Edit>
+  <New>DocumentLibraryForm</New>
+</FormTemplates>
+</file>
+
+<file path=customXml/item3.xml><?xml version="1.0" encoding="utf-8"?>
+<p:properties xmlns:p="http://schemas.microsoft.com/office/2006/metadata/properties" xmlns:xsi="http://www.w3.org/2001/XMLSchema-instance" xmlns:pc="http://schemas.microsoft.com/office/infopath/2007/PartnerControls">
+  <documentManagement/>
+</p:properties>
+</file>
+
+<file path=customXml/item4.xml><?xml version="1.0" encoding="utf-8"?>
 <ct:contentTypeSchema xmlns:ct="http://schemas.microsoft.com/office/2006/metadata/contentType" xmlns:ma="http://schemas.microsoft.com/office/2006/metadata/properties/metaAttributes" ct:_="" ma:_="" ma:contentTypeName="Dokument" ma:contentTypeID="0x010100EEC585885EB71F4DB0D9FB45E4A66F2C" ma:contentTypeVersion="3" ma:contentTypeDescription="Opprett et nytt dokument." ma:contentTypeScope="" ma:versionID="f382b6a2fd235f283bf5cecf5e56262d">
   <xsd:schema xmlns:xsd="http://www.w3.org/2001/XMLSchema" xmlns:xs="http://www.w3.org/2001/XMLSchema" xmlns:p="http://schemas.microsoft.com/office/2006/metadata/properties" xmlns:ns2="e2dd498c-680f-4fa4-b475-961296ca3ef1" targetNamespace="http://schemas.microsoft.com/office/2006/metadata/properties" ma:root="true" ma:fieldsID="c7bc32ed49db3fd258cd61b46b16d772" ns2:_="">
     <xsd:import namespace="e2dd498c-680f-4fa4-b475-961296ca3ef1"/>
@@ -14326,21 +10240,6 @@
 </ct:contentTypeSchema>
 </file>
 
-<file path=customXml/item3.xml><?xml version="1.0" encoding="utf-8"?>
-<p:properties xmlns:p="http://schemas.microsoft.com/office/2006/metadata/properties" xmlns:xsi="http://www.w3.org/2001/XMLSchema-instance" xmlns:pc="http://schemas.microsoft.com/office/infopath/2007/PartnerControls">
-  <documentManagement/>
-</p:properties>
-</file>
-
-<file path=customXml/item4.xml><?xml version="1.0" encoding="utf-8"?>
-<?mso-contentType ?>
-<FormTemplates xmlns="http://schemas.microsoft.com/sharepoint/v3/contenttype/forms">
-  <Display>DocumentLibraryForm</Display>
-  <Edit>DocumentLibraryForm</Edit>
-  <New>DocumentLibraryForm</New>
-</FormTemplates>
-</file>
-
 <file path=customXml/itemProps1.xml><?xml version="1.0" encoding="utf-8"?>
 <ds:datastoreItem xmlns:ds="http://schemas.openxmlformats.org/officeDocument/2006/customXml" ds:itemID="{E229464E-7FDA-4684-B3C1-D54AF7B00478}">
   <ds:schemaRefs>
@@ -14350,6 +10249,23 @@
 </file>
 
 <file path=customXml/itemProps2.xml><?xml version="1.0" encoding="utf-8"?>
+<ds:datastoreItem xmlns:ds="http://schemas.openxmlformats.org/officeDocument/2006/customXml" ds:itemID="{2E0ADFCC-3591-4F93-934F-89209D1D4A05}">
+  <ds:schemaRefs>
+    <ds:schemaRef ds:uri="http://schemas.microsoft.com/sharepoint/v3/contenttype/forms"/>
+  </ds:schemaRefs>
+</ds:datastoreItem>
+</file>
+
+<file path=customXml/itemProps3.xml><?xml version="1.0" encoding="utf-8"?>
+<ds:datastoreItem xmlns:ds="http://schemas.openxmlformats.org/officeDocument/2006/customXml" ds:itemID="{2B3CE95B-8845-44EA-894A-43AB4CE1AABF}">
+  <ds:schemaRefs>
+    <ds:schemaRef ds:uri="http://schemas.microsoft.com/office/2006/metadata/properties"/>
+    <ds:schemaRef ds:uri="http://schemas.microsoft.com/office/infopath/2007/PartnerControls"/>
+  </ds:schemaRefs>
+</ds:datastoreItem>
+</file>
+
+<file path=customXml/itemProps4.xml><?xml version="1.0" encoding="utf-8"?>
 <ds:datastoreItem xmlns:ds="http://schemas.openxmlformats.org/officeDocument/2006/customXml" ds:itemID="{939C2472-C9A5-4659-BFF7-5F2DFDAB9FBC}">
   <ds:schemaRefs>
     <ds:schemaRef ds:uri="http://schemas.microsoft.com/office/2006/metadata/contentType"/>
@@ -14365,21 +10281,4 @@
     <ds:schemaRef ds:uri="http://schemas.microsoft.com/internal/obd"/>
   </ds:schemaRefs>
 </ds:datastoreItem>
-</file>
-
-<file path=customXml/itemProps3.xml><?xml version="1.0" encoding="utf-8"?>
-<ds:datastoreItem xmlns:ds="http://schemas.openxmlformats.org/officeDocument/2006/customXml" ds:itemID="{2B3CE95B-8845-44EA-894A-43AB4CE1AABF}">
-  <ds:schemaRefs>
-    <ds:schemaRef ds:uri="http://schemas.microsoft.com/office/2006/metadata/properties"/>
-    <ds:schemaRef ds:uri="http://schemas.microsoft.com/office/infopath/2007/PartnerControls"/>
-  </ds:schemaRefs>
-</ds:datastoreItem>
-</file>
-
-<file path=customXml/itemProps4.xml><?xml version="1.0" encoding="utf-8"?>
-<ds:datastoreItem xmlns:ds="http://schemas.openxmlformats.org/officeDocument/2006/customXml" ds:itemID="{2E0ADFCC-3591-4F93-934F-89209D1D4A05}">
-  <ds:schemaRefs>
-    <ds:schemaRef ds:uri="http://schemas.microsoft.com/sharepoint/v3/contenttype/forms"/>
-  </ds:schemaRefs>
-</ds:datastoreItem>
 </file>
</xml_diff>